<commit_message>
feat(invoice): add bounded room and payment template rows
</commit_message>
<xml_diff>
--- a/invoice_template.docx
+++ b/invoice_template.docx
@@ -382,7 +382,35 @@
           </w:tcPr>
           <w:p>
             <w:r>
-              <w:t>{{ room_name }}</w:t>
+              <w:t>{%tr for room in rooms[:5] %}</w:t>
+            </w:r>
+          </w:p>
+        </w:tc>
+        <w:tc>
+          <w:tcPr>
+            <w:tcW w:type="dxa" w:w="3600"/>
+          </w:tcPr>
+          <w:p>
+            <w:r/>
+          </w:p>
+        </w:tc>
+        <w:tc>
+          <w:tcPr>
+            <w:tcW w:type="dxa" w:w="3600"/>
+          </w:tcPr>
+          <w:p>
+            <w:r/>
+          </w:p>
+        </w:tc>
+      </w:tr>
+      <w:tr>
+        <w:tc>
+          <w:tcPr>
+            <w:tcW w:type="dxa" w:w="3600"/>
+          </w:tcPr>
+          <w:p>
+            <w:r>
+              <w:t>{{ room.name }}</w:t>
             </w:r>
           </w:p>
         </w:tc>
@@ -392,7 +420,7 @@
           </w:tcPr>
           <w:p>
             <w:r>
-              <w:t>{{ room_qty }}</w:t>
+              <w:t>{{ room.quantity }}</w:t>
             </w:r>
           </w:p>
         </w:tc>
@@ -402,8 +430,36 @@
           </w:tcPr>
           <w:p>
             <w:r>
-              <w:t>{{ room_nights }}</w:t>
+              <w:t>{{ room.nights }}</w:t>
             </w:r>
+          </w:p>
+        </w:tc>
+      </w:tr>
+      <w:tr>
+        <w:tc>
+          <w:tcPr>
+            <w:tcW w:type="dxa" w:w="3600"/>
+          </w:tcPr>
+          <w:p>
+            <w:r>
+              <w:t>{%tr endfor %}</w:t>
+            </w:r>
+          </w:p>
+        </w:tc>
+        <w:tc>
+          <w:tcPr>
+            <w:tcW w:type="dxa" w:w="3600"/>
+          </w:tcPr>
+          <w:p>
+            <w:r/>
+          </w:p>
+        </w:tc>
+        <w:tc>
+          <w:tcPr>
+            <w:tcW w:type="dxa" w:w="3600"/>
+          </w:tcPr>
+          <w:p>
+            <w:r/>
           </w:p>
         </w:tc>
       </w:tr>
@@ -483,37 +539,101 @@
         <w:t>Payment Summary:</w:t>
       </w:r>
     </w:p>
-    <w:p>
-      <w:r>
-        <w:rPr>
-          <w:rFonts w:ascii="Calibri" w:hAnsi="Calibri"/>
-          <w:b w:val="0"/>
-          <w:sz w:val="20"/>
-        </w:rPr>
-        <w:t>{{ payment_date_1 }}  {{ payment_amount_1 }}</w:t>
-      </w:r>
-    </w:p>
-    <w:p>
-      <w:r>
-        <w:rPr>
-          <w:rFonts w:ascii="Calibri" w:hAnsi="Calibri"/>
-          <w:b w:val="0"/>
-          <w:sz w:val="20"/>
-        </w:rPr>
-        <w:t>{{ payment_date_2 }}  {{ payment_amount_2 }}</w:t>
-      </w:r>
-    </w:p>
-    <w:p>
-      <w:r>
-        <w:rPr>
-          <w:rFonts w:ascii="Calibri" w:hAnsi="Calibri"/>
-          <w:b/>
-          <w:color w:val="0B6B6B"/>
-          <w:sz w:val="20"/>
-        </w:rPr>
-        <w:t>Remaining Balance: {{ remaining_balance }}</w:t>
-      </w:r>
-    </w:p>
+    <w:tbl>
+      <w:tblPr>
+        <w:tblStyle w:val="TableGrid"/>
+        <w:tblW w:type="auto" w:w="0"/>
+        <w:tblLook w:firstColumn="1" w:firstRow="1" w:lastColumn="0" w:lastRow="0" w:noHBand="0" w:noVBand="1" w:val="04A0"/>
+      </w:tblPr>
+      <w:tblGrid>
+        <w:gridCol w:w="5400"/>
+        <w:gridCol w:w="5400"/>
+      </w:tblGrid>
+      <w:tr>
+        <w:tc>
+          <w:tcPr>
+            <w:tcW w:type="dxa" w:w="5400"/>
+          </w:tcPr>
+          <w:p>
+            <w:r>
+              <w:t>{%tr for payment in payments[:4] %}</w:t>
+            </w:r>
+          </w:p>
+        </w:tc>
+        <w:tc>
+          <w:tcPr>
+            <w:tcW w:type="dxa" w:w="5400"/>
+          </w:tcPr>
+          <w:p>
+            <w:r/>
+          </w:p>
+        </w:tc>
+      </w:tr>
+      <w:tr>
+        <w:tc>
+          <w:tcPr>
+            <w:tcW w:type="dxa" w:w="5400"/>
+          </w:tcPr>
+          <w:p>
+            <w:r>
+              <w:t>{{ payment.date }}</w:t>
+            </w:r>
+          </w:p>
+        </w:tc>
+        <w:tc>
+          <w:tcPr>
+            <w:tcW w:type="dxa" w:w="5400"/>
+          </w:tcPr>
+          <w:p>
+            <w:r>
+              <w:t>{{ payment.amount }}</w:t>
+            </w:r>
+          </w:p>
+        </w:tc>
+      </w:tr>
+      <w:tr>
+        <w:tc>
+          <w:tcPr>
+            <w:tcW w:type="dxa" w:w="5400"/>
+          </w:tcPr>
+          <w:p>
+            <w:r>
+              <w:t>{%tr endfor %}</w:t>
+            </w:r>
+          </w:p>
+        </w:tc>
+        <w:tc>
+          <w:tcPr>
+            <w:tcW w:type="dxa" w:w="5400"/>
+          </w:tcPr>
+          <w:p>
+            <w:r/>
+          </w:p>
+        </w:tc>
+      </w:tr>
+      <w:tr>
+        <w:tc>
+          <w:tcPr>
+            <w:tcW w:type="dxa" w:w="5400"/>
+          </w:tcPr>
+          <w:p>
+            <w:r>
+              <w:t>Remaining Balance:</w:t>
+            </w:r>
+          </w:p>
+        </w:tc>
+        <w:tc>
+          <w:tcPr>
+            <w:tcW w:type="dxa" w:w="5400"/>
+          </w:tcPr>
+          <w:p>
+            <w:r>
+              <w:t>{{ remaining_balance }}</w:t>
+            </w:r>
+          </w:p>
+        </w:tc>
+      </w:tr>
+    </w:tbl>
     <w:p/>
     <w:p>
       <w:r>

</xml_diff>

<commit_message>
design(invoice): update editable Word template
</commit_message>
<xml_diff>
--- a/invoice_template.docx
+++ b/invoice_template.docx
@@ -63,7 +63,17 @@
           <w:color w:val="0B6B6B"/>
           <w:sz w:val="36"/>
         </w:rPr>
-        <w:t>{{ business</w:t>
+        <w:t xml:space="preserve">{{ </w:t>
+      </w:r>
+      <w:proofErr w:type="spellStart"/>
+      <w:r>
+        <w:rPr>
+          <w:rFonts w:ascii="Calibri" w:hAnsi="Calibri"/>
+          <w:b/>
+          <w:color w:val="0B6B6B"/>
+          <w:sz w:val="36"/>
+        </w:rPr>
+        <w:t>business</w:t>
       </w:r>
       <w:proofErr w:type="gramEnd"/>
       <w:r>
@@ -83,7 +93,17 @@
           <w:color w:val="0B6B6B"/>
           <w:sz w:val="36"/>
         </w:rPr>
-        <w:t>name }</w:t>
+        <w:t>name</w:t>
+      </w:r>
+      <w:proofErr w:type="spellEnd"/>
+      <w:r>
+        <w:rPr>
+          <w:rFonts w:ascii="Calibri" w:hAnsi="Calibri"/>
+          <w:b/>
+          <w:color w:val="0B6B6B"/>
+          <w:sz w:val="36"/>
+        </w:rPr>
+        <w:t xml:space="preserve"> }</w:t>
       </w:r>
       <w:proofErr w:type="gramEnd"/>
       <w:r>
@@ -102,7 +122,23 @@
           <w:rFonts w:ascii="Calibri" w:hAnsi="Calibri"/>
           <w:sz w:val="18"/>
         </w:rPr>
-        <w:t>{{ business_address }}</w:t>
+        <w:t xml:space="preserve">{{ </w:t>
+      </w:r>
+      <w:proofErr w:type="spellStart"/>
+      <w:r>
+        <w:rPr>
+          <w:rFonts w:ascii="Calibri" w:hAnsi="Calibri"/>
+          <w:sz w:val="18"/>
+        </w:rPr>
+        <w:t>business_address</w:t>
+      </w:r>
+      <w:proofErr w:type="spellEnd"/>
+      <w:r>
+        <w:rPr>
+          <w:rFonts w:ascii="Calibri" w:hAnsi="Calibri"/>
+          <w:sz w:val="18"/>
+        </w:rPr>
+        <w:t xml:space="preserve"> }}</w:t>
       </w:r>
     </w:p>
     <w:p>
@@ -111,7 +147,55 @@
           <w:rFonts w:ascii="Calibri" w:hAnsi="Calibri"/>
           <w:sz w:val="18"/>
         </w:rPr>
-        <w:t>{{ business_phone }} | {{ business_email }} | {{ business_website }}</w:t>
+        <w:t xml:space="preserve">{{ </w:t>
+      </w:r>
+      <w:proofErr w:type="spellStart"/>
+      <w:r>
+        <w:rPr>
+          <w:rFonts w:ascii="Calibri" w:hAnsi="Calibri"/>
+          <w:sz w:val="18"/>
+        </w:rPr>
+        <w:t>business_phone</w:t>
+      </w:r>
+      <w:proofErr w:type="spellEnd"/>
+      <w:r>
+        <w:rPr>
+          <w:rFonts w:ascii="Calibri" w:hAnsi="Calibri"/>
+          <w:sz w:val="18"/>
+        </w:rPr>
+        <w:t xml:space="preserve"> }} | {{ </w:t>
+      </w:r>
+      <w:proofErr w:type="spellStart"/>
+      <w:r>
+        <w:rPr>
+          <w:rFonts w:ascii="Calibri" w:hAnsi="Calibri"/>
+          <w:sz w:val="18"/>
+        </w:rPr>
+        <w:t>business_email</w:t>
+      </w:r>
+      <w:proofErr w:type="spellEnd"/>
+      <w:r>
+        <w:rPr>
+          <w:rFonts w:ascii="Calibri" w:hAnsi="Calibri"/>
+          <w:sz w:val="18"/>
+        </w:rPr>
+        <w:t xml:space="preserve"> }} | {{ </w:t>
+      </w:r>
+      <w:proofErr w:type="spellStart"/>
+      <w:r>
+        <w:rPr>
+          <w:rFonts w:ascii="Calibri" w:hAnsi="Calibri"/>
+          <w:sz w:val="18"/>
+        </w:rPr>
+        <w:t>business_website</w:t>
+      </w:r>
+      <w:proofErr w:type="spellEnd"/>
+      <w:r>
+        <w:rPr>
+          <w:rFonts w:ascii="Calibri" w:hAnsi="Calibri"/>
+          <w:sz w:val="18"/>
+        </w:rPr>
+        <w:t xml:space="preserve"> }}</w:t>
       </w:r>
     </w:p>
     <w:p>
@@ -120,7 +204,23 @@
           <w:rFonts w:ascii="Calibri" w:hAnsi="Calibri"/>
           <w:sz w:val="18"/>
         </w:rPr>
-        <w:t>Tax ID: {{ tax_id }}</w:t>
+        <w:t xml:space="preserve">Tax ID: {{ </w:t>
+      </w:r>
+      <w:proofErr w:type="spellStart"/>
+      <w:r>
+        <w:rPr>
+          <w:rFonts w:ascii="Calibri" w:hAnsi="Calibri"/>
+          <w:sz w:val="18"/>
+        </w:rPr>
+        <w:t>tax_id</w:t>
+      </w:r>
+      <w:proofErr w:type="spellEnd"/>
+      <w:r>
+        <w:rPr>
+          <w:rFonts w:ascii="Calibri" w:hAnsi="Calibri"/>
+          <w:sz w:val="18"/>
+        </w:rPr>
+        <w:t xml:space="preserve"> }}</w:t>
       </w:r>
     </w:p>
     <w:p/>
@@ -143,7 +243,27 @@
           <w:color w:val="0B6B6B"/>
           <w:sz w:val="32"/>
         </w:rPr>
-        <w:t>{{ guest_name }}</w:t>
+        <w:t xml:space="preserve">{{ </w:t>
+      </w:r>
+      <w:proofErr w:type="spellStart"/>
+      <w:r>
+        <w:rPr>
+          <w:rFonts w:ascii="Calibri" w:hAnsi="Calibri"/>
+          <w:b/>
+          <w:color w:val="0B6B6B"/>
+          <w:sz w:val="32"/>
+        </w:rPr>
+        <w:t>guest_name</w:t>
+      </w:r>
+      <w:proofErr w:type="spellEnd"/>
+      <w:r>
+        <w:rPr>
+          <w:rFonts w:ascii="Calibri" w:hAnsi="Calibri"/>
+          <w:b/>
+          <w:color w:val="0B6B6B"/>
+          <w:sz w:val="32"/>
+        </w:rPr>
+        <w:t xml:space="preserve"> }}</w:t>
       </w:r>
     </w:p>
     <w:p/>
@@ -174,7 +294,15 @@
           </w:tcPr>
           <w:p>
             <w:r>
-              <w:t>{{ invoice_number }}</w:t>
+              <w:t xml:space="preserve">{{ </w:t>
+            </w:r>
+            <w:proofErr w:type="spellStart"/>
+            <w:r>
+              <w:t>invoice_number</w:t>
+            </w:r>
+            <w:proofErr w:type="spellEnd"/>
+            <w:r>
+              <w:t xml:space="preserve"> }}</w:t>
             </w:r>
           </w:p>
         </w:tc>
@@ -196,7 +324,15 @@
           </w:tcPr>
           <w:p>
             <w:r>
-              <w:t>{{ issue_date }}</w:t>
+              <w:t xml:space="preserve">{{ </w:t>
+            </w:r>
+            <w:proofErr w:type="spellStart"/>
+            <w:r>
+              <w:t>issue_date</w:t>
+            </w:r>
+            <w:proofErr w:type="spellEnd"/>
+            <w:r>
+              <w:t xml:space="preserve"> }}</w:t>
             </w:r>
           </w:p>
         </w:tc>
@@ -240,15 +376,39 @@
           </w:tcPr>
           <w:p>
             <w:r>
-              <w:t>{{ guest_name }}</w:t>
+              <w:t xml:space="preserve">{{ </w:t>
+            </w:r>
+            <w:proofErr w:type="spellStart"/>
+            <w:r>
+              <w:t>guest_name</w:t>
+            </w:r>
+            <w:proofErr w:type="spellEnd"/>
+            <w:r>
+              <w:t xml:space="preserve"> }}</w:t>
             </w:r>
             <w:r>
               <w:br/>
-              <w:t>{{ guest_email }}</w:t>
+              <w:t xml:space="preserve">{{ </w:t>
+            </w:r>
+            <w:proofErr w:type="spellStart"/>
+            <w:r>
+              <w:t>guest_email</w:t>
+            </w:r>
+            <w:proofErr w:type="spellEnd"/>
+            <w:r>
+              <w:t xml:space="preserve"> }}</w:t>
             </w:r>
             <w:r>
               <w:br/>
-              <w:t>{{ guest_phone }}</w:t>
+              <w:t xml:space="preserve">{{ </w:t>
+            </w:r>
+            <w:proofErr w:type="spellStart"/>
+            <w:r>
+              <w:t>guest_phone</w:t>
+            </w:r>
+            <w:proofErr w:type="spellEnd"/>
+            <w:r>
+              <w:t xml:space="preserve"> }}</w:t>
             </w:r>
           </w:p>
         </w:tc>
@@ -271,7 +431,39 @@
           <w:rFonts w:ascii="Calibri" w:hAnsi="Calibri"/>
           <w:sz w:val="20"/>
         </w:rPr>
-        <w:t>Stay: {{ check_in }} to {{ check_out }}</w:t>
+        <w:t xml:space="preserve">Stay: {{ </w:t>
+      </w:r>
+      <w:proofErr w:type="spellStart"/>
+      <w:r>
+        <w:rPr>
+          <w:rFonts w:ascii="Calibri" w:hAnsi="Calibri"/>
+          <w:sz w:val="20"/>
+        </w:rPr>
+        <w:t>check_in</w:t>
+      </w:r>
+      <w:proofErr w:type="spellEnd"/>
+      <w:r>
+        <w:rPr>
+          <w:rFonts w:ascii="Calibri" w:hAnsi="Calibri"/>
+          <w:sz w:val="20"/>
+        </w:rPr>
+        <w:t xml:space="preserve"> }} to {{ </w:t>
+      </w:r>
+      <w:proofErr w:type="spellStart"/>
+      <w:r>
+        <w:rPr>
+          <w:rFonts w:ascii="Calibri" w:hAnsi="Calibri"/>
+          <w:sz w:val="20"/>
+        </w:rPr>
+        <w:t>check_out</w:t>
+      </w:r>
+      <w:proofErr w:type="spellEnd"/>
+      <w:r>
+        <w:rPr>
+          <w:rFonts w:ascii="Calibri" w:hAnsi="Calibri"/>
+          <w:sz w:val="20"/>
+        </w:rPr>
+        <w:t xml:space="preserve"> }}</w:t>
       </w:r>
     </w:p>
     <w:p>
@@ -280,7 +472,23 @@
           <w:rFonts w:ascii="Calibri" w:hAnsi="Calibri"/>
           <w:sz w:val="20"/>
         </w:rPr>
-        <w:t>Package: {{ package_title }}</w:t>
+        <w:t xml:space="preserve">Package: {{ </w:t>
+      </w:r>
+      <w:proofErr w:type="spellStart"/>
+      <w:r>
+        <w:rPr>
+          <w:rFonts w:ascii="Calibri" w:hAnsi="Calibri"/>
+          <w:sz w:val="20"/>
+        </w:rPr>
+        <w:t>package_title</w:t>
+      </w:r>
+      <w:proofErr w:type="spellEnd"/>
+      <w:r>
+        <w:rPr>
+          <w:rFonts w:ascii="Calibri" w:hAnsi="Calibri"/>
+          <w:sz w:val="20"/>
+        </w:rPr>
+        <w:t xml:space="preserve"> }}</w:t>
       </w:r>
     </w:p>
     <w:p>
@@ -289,7 +497,23 @@
           <w:rFonts w:ascii="Calibri" w:hAnsi="Calibri"/>
           <w:sz w:val="20"/>
         </w:rPr>
-        <w:t>Total Guests: {{ total_guests }}</w:t>
+        <w:t xml:space="preserve">Total Guests: {{ </w:t>
+      </w:r>
+      <w:proofErr w:type="spellStart"/>
+      <w:r>
+        <w:rPr>
+          <w:rFonts w:ascii="Calibri" w:hAnsi="Calibri"/>
+          <w:sz w:val="20"/>
+        </w:rPr>
+        <w:t>total_guests</w:t>
+      </w:r>
+      <w:proofErr w:type="spellEnd"/>
+      <w:r>
+        <w:rPr>
+          <w:rFonts w:ascii="Calibri" w:hAnsi="Calibri"/>
+          <w:sz w:val="20"/>
+        </w:rPr>
+        <w:t xml:space="preserve"> }}</w:t>
       </w:r>
     </w:p>
     <w:p/>
@@ -329,8 +553,24 @@
             <w:tcW w:w="5400" w:type="dxa"/>
           </w:tcPr>
           <w:p>
+            <w:pPr>
+              <w:jc w:val="right"/>
+            </w:pPr>
+            <w:proofErr w:type="gramStart"/>
             <w:r>
-              <w:t>{{ subtotal_net }}</w:t>
+              <w:t xml:space="preserve">{{ </w:t>
+            </w:r>
+            <w:proofErr w:type="spellStart"/>
+            <w:r>
+              <w:t>subtotal</w:t>
+            </w:r>
+            <w:proofErr w:type="gramEnd"/>
+            <w:r>
+              <w:t>_net</w:t>
+            </w:r>
+            <w:proofErr w:type="spellEnd"/>
+            <w:r>
+              <w:t xml:space="preserve"> }}</w:t>
             </w:r>
           </w:p>
         </w:tc>
@@ -351,8 +591,19 @@
             <w:tcW w:w="5400" w:type="dxa"/>
           </w:tcPr>
           <w:p>
+            <w:pPr>
+              <w:jc w:val="right"/>
+            </w:pPr>
             <w:r>
-              <w:t>{{ total_vat }}</w:t>
+              <w:t xml:space="preserve">{{ </w:t>
+            </w:r>
+            <w:proofErr w:type="spellStart"/>
+            <w:r>
+              <w:t>total_vat</w:t>
+            </w:r>
+            <w:proofErr w:type="spellEnd"/>
+            <w:r>
+              <w:t xml:space="preserve"> }}</w:t>
             </w:r>
           </w:p>
         </w:tc>
@@ -373,8 +624,19 @@
             <w:tcW w:w="5400" w:type="dxa"/>
           </w:tcPr>
           <w:p>
+            <w:pPr>
+              <w:jc w:val="right"/>
+            </w:pPr>
             <w:r>
-              <w:t>{{ property_fee }}</w:t>
+              <w:t xml:space="preserve">{{ </w:t>
+            </w:r>
+            <w:proofErr w:type="spellStart"/>
+            <w:r>
+              <w:t>property_fee</w:t>
+            </w:r>
+            <w:proofErr w:type="spellEnd"/>
+            <w:r>
+              <w:t xml:space="preserve"> }}</w:t>
             </w:r>
           </w:p>
         </w:tc>
@@ -395,8 +657,19 @@
             <w:tcW w:w="5400" w:type="dxa"/>
           </w:tcPr>
           <w:p>
+            <w:pPr>
+              <w:jc w:val="right"/>
+            </w:pPr>
             <w:r>
-              <w:t>{{ total_due }}</w:t>
+              <w:t xml:space="preserve">{{ </w:t>
+            </w:r>
+            <w:proofErr w:type="spellStart"/>
+            <w:r>
+              <w:t>total_due</w:t>
+            </w:r>
+            <w:proofErr w:type="spellEnd"/>
+            <w:r>
+              <w:t xml:space="preserve"> }}</w:t>
             </w:r>
           </w:p>
         </w:tc>
@@ -440,6 +713,9 @@
             <w:tcW w:w="3600" w:type="dxa"/>
           </w:tcPr>
           <w:p>
+            <w:pPr>
+              <w:jc w:val="right"/>
+            </w:pPr>
             <w:r>
               <w:t>Qty</w:t>
             </w:r>
@@ -450,6 +726,9 @@
             <w:tcW w:w="3600" w:type="dxa"/>
           </w:tcPr>
           <w:p>
+            <w:pPr>
+              <w:jc w:val="right"/>
+            </w:pPr>
             <w:r>
               <w:t>Nights</w:t>
             </w:r>
@@ -496,8 +775,19 @@
             <w:tcW w:w="3600" w:type="dxa"/>
           </w:tcPr>
           <w:p>
+            <w:pPr>
+              <w:jc w:val="right"/>
+            </w:pPr>
             <w:r>
-              <w:t>{{ room.quantity }}</w:t>
+              <w:t xml:space="preserve">{{ </w:t>
+            </w:r>
+            <w:proofErr w:type="spellStart"/>
+            <w:r>
+              <w:t>room.quantity</w:t>
+            </w:r>
+            <w:proofErr w:type="spellEnd"/>
+            <w:r>
+              <w:t xml:space="preserve"> }}</w:t>
             </w:r>
           </w:p>
         </w:tc>
@@ -506,8 +796,19 @@
             <w:tcW w:w="3600" w:type="dxa"/>
           </w:tcPr>
           <w:p>
+            <w:pPr>
+              <w:jc w:val="right"/>
+            </w:pPr>
             <w:r>
-              <w:t>{{ room.nights }}</w:t>
+              <w:t xml:space="preserve">{{ </w:t>
+            </w:r>
+            <w:proofErr w:type="spellStart"/>
+            <w:r>
+              <w:t>room.nights</w:t>
+            </w:r>
+            <w:proofErr w:type="spellEnd"/>
+            <w:r>
+              <w:t xml:space="preserve"> }}</w:t>
             </w:r>
           </w:p>
         </w:tc>
@@ -519,7 +820,15 @@
           </w:tcPr>
           <w:p>
             <w:r>
-              <w:t>{%tr endfor %}</w:t>
+              <w:t xml:space="preserve">{%tr </w:t>
+            </w:r>
+            <w:proofErr w:type="spellStart"/>
+            <w:r>
+              <w:t>endfor</w:t>
+            </w:r>
+            <w:proofErr w:type="spellEnd"/>
+            <w:r>
+              <w:t xml:space="preserve"> %}</w:t>
             </w:r>
           </w:p>
         </w:tc>
@@ -538,24 +847,29 @@
       </w:tr>
     </w:tbl>
     <w:p/>
+    <w:p/>
     <w:p>
+      <w:pPr>
+        <w:rPr>
+          <w:rFonts w:ascii="Calibri" w:hAnsi="Calibri"/>
+          <w:b/>
+        </w:rPr>
+      </w:pPr>
       <w:r>
         <w:rPr>
+          <w:rFonts w:ascii="Calibri" w:hAnsi="Calibri"/>
           <w:b/>
         </w:rPr>
-        <w:t xml:space="preserve">Payment Terms: </w:t>
-      </w:r>
-      <w:r>
-        <w:t>A 50% deposit is processed upon booking and the remaining balance will be processed 30 days prior to arrival. You will receive a payment link by email for the deposit payment within a few days.</w:t>
+        <w:br w:type="page"/>
       </w:r>
     </w:p>
-    <w:p/>
     <w:p>
       <w:r>
         <w:rPr>
           <w:rFonts w:ascii="Calibri" w:hAnsi="Calibri"/>
           <w:b/>
         </w:rPr>
+        <w:lastRenderedPageBreak/>
         <w:t>Dominica VAT Summary:</w:t>
       </w:r>
     </w:p>
@@ -565,7 +879,69 @@
           <w:rFonts w:ascii="Calibri" w:hAnsi="Calibri"/>
           <w:sz w:val="20"/>
         </w:rPr>
-        <w:t>Subtotal: {{ subtotal_net }}</w:t>
+        <w:t xml:space="preserve">Subtotal: </w:t>
+      </w:r>
+      <w:r>
+        <w:rPr>
+          <w:rFonts w:ascii="Calibri" w:hAnsi="Calibri"/>
+          <w:sz w:val="20"/>
+        </w:rPr>
+        <w:tab/>
+      </w:r>
+      <w:r>
+        <w:rPr>
+          <w:rFonts w:ascii="Calibri" w:hAnsi="Calibri"/>
+          <w:sz w:val="20"/>
+        </w:rPr>
+        <w:tab/>
+      </w:r>
+      <w:proofErr w:type="gramStart"/>
+      <w:r>
+        <w:rPr>
+          <w:rFonts w:ascii="Calibri" w:hAnsi="Calibri"/>
+          <w:sz w:val="20"/>
+        </w:rPr>
+        <w:t xml:space="preserve">{{ </w:t>
+      </w:r>
+      <w:proofErr w:type="spellStart"/>
+      <w:r>
+        <w:rPr>
+          <w:rFonts w:ascii="Calibri" w:hAnsi="Calibri"/>
+          <w:sz w:val="20"/>
+        </w:rPr>
+        <w:t>subtotal</w:t>
+      </w:r>
+      <w:proofErr w:type="gramEnd"/>
+      <w:r>
+        <w:rPr>
+          <w:rFonts w:ascii="Calibri" w:hAnsi="Calibri"/>
+          <w:sz w:val="20"/>
+        </w:rPr>
+        <w:t>_</w:t>
+      </w:r>
+      <w:proofErr w:type="gramStart"/>
+      <w:r>
+        <w:rPr>
+          <w:rFonts w:ascii="Calibri" w:hAnsi="Calibri"/>
+          <w:sz w:val="20"/>
+        </w:rPr>
+        <w:t>net</w:t>
+      </w:r>
+      <w:proofErr w:type="spellEnd"/>
+      <w:r>
+        <w:rPr>
+          <w:rFonts w:ascii="Calibri" w:hAnsi="Calibri"/>
+          <w:sz w:val="20"/>
+        </w:rPr>
+        <w:t xml:space="preserve"> }</w:t>
+      </w:r>
+      <w:proofErr w:type="gramEnd"/>
+      <w:r>
+        <w:rPr>
+          <w:rFonts w:ascii="Calibri" w:hAnsi="Calibri"/>
+          <w:sz w:val="20"/>
+        </w:rPr>
+        <w:t>}</w:t>
       </w:r>
     </w:p>
     <w:p>
@@ -574,7 +950,62 @@
           <w:rFonts w:ascii="Calibri" w:hAnsi="Calibri"/>
           <w:sz w:val="20"/>
         </w:rPr>
-        <w:t>Accommodation VAT: {{ accommodation_vat_formula }}</w:t>
+        <w:t xml:space="preserve">Accommodation VAT: </w:t>
+      </w:r>
+      <w:r>
+        <w:rPr>
+          <w:rFonts w:ascii="Calibri" w:hAnsi="Calibri"/>
+          <w:sz w:val="20"/>
+        </w:rPr>
+        <w:tab/>
+      </w:r>
+      <w:proofErr w:type="gramStart"/>
+      <w:r>
+        <w:rPr>
+          <w:rFonts w:ascii="Calibri" w:hAnsi="Calibri"/>
+          <w:sz w:val="20"/>
+        </w:rPr>
+        <w:t xml:space="preserve">{{ </w:t>
+      </w:r>
+      <w:proofErr w:type="spellStart"/>
+      <w:r>
+        <w:rPr>
+          <w:rFonts w:ascii="Calibri" w:hAnsi="Calibri"/>
+          <w:sz w:val="20"/>
+        </w:rPr>
+        <w:t>accommodation</w:t>
+      </w:r>
+      <w:proofErr w:type="gramEnd"/>
+      <w:r>
+        <w:rPr>
+          <w:rFonts w:ascii="Calibri" w:hAnsi="Calibri"/>
+          <w:sz w:val="20"/>
+        </w:rPr>
+        <w:t>_vat_</w:t>
+      </w:r>
+      <w:proofErr w:type="gramStart"/>
+      <w:r>
+        <w:rPr>
+          <w:rFonts w:ascii="Calibri" w:hAnsi="Calibri"/>
+          <w:sz w:val="20"/>
+        </w:rPr>
+        <w:t>formula</w:t>
+      </w:r>
+      <w:proofErr w:type="spellEnd"/>
+      <w:r>
+        <w:rPr>
+          <w:rFonts w:ascii="Calibri" w:hAnsi="Calibri"/>
+          <w:sz w:val="20"/>
+        </w:rPr>
+        <w:t xml:space="preserve"> }</w:t>
+      </w:r>
+      <w:proofErr w:type="gramEnd"/>
+      <w:r>
+        <w:rPr>
+          <w:rFonts w:ascii="Calibri" w:hAnsi="Calibri"/>
+          <w:sz w:val="20"/>
+        </w:rPr>
+        <w:t>}</w:t>
       </w:r>
     </w:p>
     <w:p>
@@ -583,7 +1014,69 @@
           <w:rFonts w:ascii="Calibri" w:hAnsi="Calibri"/>
           <w:sz w:val="20"/>
         </w:rPr>
-        <w:t>Services VAT: {{ services_vat_formula }}</w:t>
+        <w:t xml:space="preserve">Services VAT: </w:t>
+      </w:r>
+      <w:r>
+        <w:rPr>
+          <w:rFonts w:ascii="Calibri" w:hAnsi="Calibri"/>
+          <w:sz w:val="20"/>
+        </w:rPr>
+        <w:tab/>
+      </w:r>
+      <w:r>
+        <w:rPr>
+          <w:rFonts w:ascii="Calibri" w:hAnsi="Calibri"/>
+          <w:sz w:val="20"/>
+        </w:rPr>
+        <w:tab/>
+      </w:r>
+      <w:proofErr w:type="gramStart"/>
+      <w:r>
+        <w:rPr>
+          <w:rFonts w:ascii="Calibri" w:hAnsi="Calibri"/>
+          <w:sz w:val="20"/>
+        </w:rPr>
+        <w:t xml:space="preserve">{{ </w:t>
+      </w:r>
+      <w:proofErr w:type="spellStart"/>
+      <w:r>
+        <w:rPr>
+          <w:rFonts w:ascii="Calibri" w:hAnsi="Calibri"/>
+          <w:sz w:val="20"/>
+        </w:rPr>
+        <w:t>services</w:t>
+      </w:r>
+      <w:proofErr w:type="gramEnd"/>
+      <w:r>
+        <w:rPr>
+          <w:rFonts w:ascii="Calibri" w:hAnsi="Calibri"/>
+          <w:sz w:val="20"/>
+        </w:rPr>
+        <w:t>_vat_</w:t>
+      </w:r>
+      <w:proofErr w:type="gramStart"/>
+      <w:r>
+        <w:rPr>
+          <w:rFonts w:ascii="Calibri" w:hAnsi="Calibri"/>
+          <w:sz w:val="20"/>
+        </w:rPr>
+        <w:t>formula</w:t>
+      </w:r>
+      <w:proofErr w:type="spellEnd"/>
+      <w:r>
+        <w:rPr>
+          <w:rFonts w:ascii="Calibri" w:hAnsi="Calibri"/>
+          <w:sz w:val="20"/>
+        </w:rPr>
+        <w:t xml:space="preserve"> }</w:t>
+      </w:r>
+      <w:proofErr w:type="gramEnd"/>
+      <w:r>
+        <w:rPr>
+          <w:rFonts w:ascii="Calibri" w:hAnsi="Calibri"/>
+          <w:sz w:val="20"/>
+        </w:rPr>
+        <w:t>}</w:t>
       </w:r>
     </w:p>
     <w:p>
@@ -594,7 +1087,85 @@
           <w:color w:val="0B6B6B"/>
           <w:sz w:val="20"/>
         </w:rPr>
-        <w:t>Total VAT: {{ total_vat }}</w:t>
+        <w:t xml:space="preserve">Total VAT: </w:t>
+      </w:r>
+      <w:r>
+        <w:rPr>
+          <w:rFonts w:ascii="Calibri" w:hAnsi="Calibri"/>
+          <w:b/>
+          <w:color w:val="0B6B6B"/>
+          <w:sz w:val="20"/>
+        </w:rPr>
+        <w:tab/>
+      </w:r>
+      <w:r>
+        <w:rPr>
+          <w:rFonts w:ascii="Calibri" w:hAnsi="Calibri"/>
+          <w:b/>
+          <w:color w:val="0B6B6B"/>
+          <w:sz w:val="20"/>
+        </w:rPr>
+        <w:tab/>
+      </w:r>
+      <w:proofErr w:type="gramStart"/>
+      <w:r>
+        <w:rPr>
+          <w:rFonts w:ascii="Calibri" w:hAnsi="Calibri"/>
+          <w:b/>
+          <w:color w:val="0B6B6B"/>
+          <w:sz w:val="20"/>
+        </w:rPr>
+        <w:t xml:space="preserve">{{ </w:t>
+      </w:r>
+      <w:proofErr w:type="spellStart"/>
+      <w:r>
+        <w:rPr>
+          <w:rFonts w:ascii="Calibri" w:hAnsi="Calibri"/>
+          <w:b/>
+          <w:color w:val="0B6B6B"/>
+          <w:sz w:val="20"/>
+        </w:rPr>
+        <w:t>total</w:t>
+      </w:r>
+      <w:proofErr w:type="gramEnd"/>
+      <w:r>
+        <w:rPr>
+          <w:rFonts w:ascii="Calibri" w:hAnsi="Calibri"/>
+          <w:b/>
+          <w:color w:val="0B6B6B"/>
+          <w:sz w:val="20"/>
+        </w:rPr>
+        <w:t>_</w:t>
+      </w:r>
+      <w:proofErr w:type="gramStart"/>
+      <w:r>
+        <w:rPr>
+          <w:rFonts w:ascii="Calibri" w:hAnsi="Calibri"/>
+          <w:b/>
+          <w:color w:val="0B6B6B"/>
+          <w:sz w:val="20"/>
+        </w:rPr>
+        <w:t>vat</w:t>
+      </w:r>
+      <w:proofErr w:type="spellEnd"/>
+      <w:r>
+        <w:rPr>
+          <w:rFonts w:ascii="Calibri" w:hAnsi="Calibri"/>
+          <w:b/>
+          <w:color w:val="0B6B6B"/>
+          <w:sz w:val="20"/>
+        </w:rPr>
+        <w:t xml:space="preserve"> }</w:t>
+      </w:r>
+      <w:proofErr w:type="gramEnd"/>
+      <w:r>
+        <w:rPr>
+          <w:rFonts w:ascii="Calibri" w:hAnsi="Calibri"/>
+          <w:b/>
+          <w:color w:val="0B6B6B"/>
+          <w:sz w:val="20"/>
+        </w:rPr>
+        <w:t>}</w:t>
       </w:r>
     </w:p>
     <w:p/>
@@ -642,7 +1213,15 @@
           </w:tcPr>
           <w:p>
             <w:r>
-              <w:t>{{ payment.date }}</w:t>
+              <w:t xml:space="preserve">{{ </w:t>
+            </w:r>
+            <w:proofErr w:type="spellStart"/>
+            <w:r>
+              <w:t>payment.date</w:t>
+            </w:r>
+            <w:proofErr w:type="spellEnd"/>
+            <w:r>
+              <w:t xml:space="preserve"> }}</w:t>
             </w:r>
           </w:p>
         </w:tc>
@@ -651,8 +1230,19 @@
             <w:tcW w:w="5400" w:type="dxa"/>
           </w:tcPr>
           <w:p>
+            <w:pPr>
+              <w:jc w:val="right"/>
+            </w:pPr>
             <w:r>
-              <w:t>{{ payment.amount }}</w:t>
+              <w:t xml:space="preserve">{{ </w:t>
+            </w:r>
+            <w:proofErr w:type="spellStart"/>
+            <w:r>
+              <w:t>payment.amount</w:t>
+            </w:r>
+            <w:proofErr w:type="spellEnd"/>
+            <w:r>
+              <w:t xml:space="preserve"> }}</w:t>
             </w:r>
           </w:p>
         </w:tc>
@@ -664,7 +1254,15 @@
           </w:tcPr>
           <w:p>
             <w:r>
-              <w:t>{%tr endfor %}</w:t>
+              <w:t xml:space="preserve">{%tr </w:t>
+            </w:r>
+            <w:proofErr w:type="spellStart"/>
+            <w:r>
+              <w:t>endfor</w:t>
+            </w:r>
+            <w:proofErr w:type="spellEnd"/>
+            <w:r>
+              <w:t xml:space="preserve"> %}</w:t>
             </w:r>
           </w:p>
         </w:tc>
@@ -691,8 +1289,19 @@
             <w:tcW w:w="5400" w:type="dxa"/>
           </w:tcPr>
           <w:p>
+            <w:pPr>
+              <w:jc w:val="right"/>
+            </w:pPr>
             <w:r>
-              <w:t>{{ remaining_balance }}</w:t>
+              <w:t xml:space="preserve">{{ </w:t>
+            </w:r>
+            <w:proofErr w:type="spellStart"/>
+            <w:r>
+              <w:t>remaining_balance</w:t>
+            </w:r>
+            <w:proofErr w:type="spellEnd"/>
+            <w:r>
+              <w:t xml:space="preserve"> }}</w:t>
             </w:r>
           </w:p>
         </w:tc>
@@ -1652,6 +2261,7 @@
   <w:style w:type="character" w:default="1" w:styleId="DefaultParagraphFont">
     <w:name w:val="Default Paragraph Font"/>
     <w:uiPriority w:val="1"/>
+    <w:semiHidden/>
     <w:unhideWhenUsed/>
   </w:style>
   <w:style w:type="table" w:default="1" w:styleId="TableNormal">

</xml_diff>

<commit_message>
design(invoice): refine Word VAT summary layout
</commit_message>
<xml_diff>
--- a/invoice_template.docx
+++ b/invoice_template.docx
@@ -3,6 +3,14 @@
 <w:document xmlns:wpc="http://schemas.microsoft.com/office/word/2010/wordprocessingCanvas" xmlns:cx="http://schemas.microsoft.com/office/drawing/2014/chartex" xmlns:cx1="http://schemas.microsoft.com/office/drawing/2015/9/8/chartex" xmlns:cx2="http://schemas.microsoft.com/office/drawing/2015/10/21/chartex" xmlns:cx3="http://schemas.microsoft.com/office/drawing/2016/5/9/chartex" xmlns:cx4="http://schemas.microsoft.com/office/drawing/2016/5/10/chartex" xmlns:cx5="http://schemas.microsoft.com/office/drawing/2016/5/11/chartex" xmlns:cx6="http://schemas.microsoft.com/office/drawing/2016/5/12/chartex" xmlns:cx7="http://schemas.microsoft.com/office/drawing/2016/5/13/chartex" xmlns:cx8="http://schemas.microsoft.com/office/drawing/2016/5/14/chartex" xmlns:mc="http://schemas.openxmlformats.org/markup-compatibility/2006" xmlns:aink="http://schemas.microsoft.com/office/drawing/2016/ink" xmlns:am3d="http://schemas.microsoft.com/office/drawing/2017/model3d" xmlns:o="urn:schemas-microsoft-com:office:office" xmlns:oel="http://schemas.microsoft.com/office/2019/extlst" xmlns:r="http://schemas.openxmlformats.org/officeDocument/2006/relationships" xmlns:m="http://schemas.openxmlformats.org/officeDocument/2006/math" xmlns:v="urn:schemas-microsoft-com:vml" xmlns:wp14="http://schemas.microsoft.com/office/word/2010/wordprocessingDrawing" xmlns:wp="http://schemas.openxmlformats.org/drawingml/2006/wordprocessingDrawing" xmlns:w10="urn:schemas-microsoft-com:office:word" xmlns:w="http://schemas.openxmlformats.org/wordprocessingml/2006/main" xmlns:w14="http://schemas.microsoft.com/office/word/2010/wordml" xmlns:w15="http://schemas.microsoft.com/office/word/2012/wordml" xmlns:w16cei="http://schemas.microsoft.com/office/word/2026/wordml/cei" xmlns:w16cex="http://schemas.microsoft.com/office/word/2018/wordml/cex" xmlns:w16cid="http://schemas.microsoft.com/office/word/2016/wordml/cid" xmlns:w16="http://schemas.microsoft.com/office/word/2018/wordml" xmlns:w16du="http://schemas.microsoft.com/office/word/2023/wordml/word16du" xmlns:w16sdtdh="http://schemas.microsoft.com/office/word/2020/wordml/sdtdatahash" xmlns:w16sdtfl="http://schemas.microsoft.com/office/word/2024/wordml/sdtformatlock" xmlns:w16se="http://schemas.microsoft.com/office/word/2015/wordml/symex" xmlns:wpg="http://schemas.microsoft.com/office/word/2010/wordprocessingGroup" xmlns:wpi="http://schemas.microsoft.com/office/word/2010/wordprocessingInk" xmlns:wne="http://schemas.microsoft.com/office/word/2006/wordml" xmlns:wps="http://schemas.microsoft.com/office/word/2010/wordprocessingShape" mc:Ignorable="w14 w15 w16se w16cid w16 w16cex w16sdtdh w16sdtfl w16du wp14">
   <w:body>
     <w:p>
+      <w:pPr>
+        <w:rPr>
+          <w:rFonts w:ascii="Calibri" w:hAnsi="Calibri"/>
+          <w:b/>
+          <w:color w:val="0B6B6B"/>
+          <w:sz w:val="36"/>
+        </w:rPr>
+      </w:pPr>
       <w:r>
         <w:rPr>
           <w:rFonts w:ascii="Calibri" w:hAnsi="Calibri"/>
@@ -117,6 +125,47 @@
       </w:r>
     </w:p>
     <w:p>
+      <w:pPr>
+        <w:rPr>
+          <w:sz w:val="24"/>
+          <w:szCs w:val="24"/>
+        </w:rPr>
+      </w:pPr>
+      <w:r>
+        <w:rPr>
+          <w:rFonts w:ascii="Calibri" w:hAnsi="Calibri"/>
+          <w:b/>
+          <w:color w:val="0B6B6B"/>
+          <w:sz w:val="24"/>
+          <w:szCs w:val="24"/>
+        </w:rPr>
+        <w:t xml:space="preserve">Caribbean </w:t>
+      </w:r>
+      <w:proofErr w:type="gramStart"/>
+      <w:r>
+        <w:rPr>
+          <w:rFonts w:ascii="Calibri" w:hAnsi="Calibri"/>
+          <w:b/>
+          <w:color w:val="0B6B6B"/>
+          <w:sz w:val="24"/>
+          <w:szCs w:val="24"/>
+        </w:rPr>
+        <w:t>Appalachia,</w:t>
+      </w:r>
+      <w:proofErr w:type="gramEnd"/>
+      <w:r>
+        <w:rPr>
+          <w:rFonts w:ascii="Calibri" w:hAnsi="Calibri"/>
+          <w:b/>
+          <w:color w:val="0B6B6B"/>
+          <w:sz w:val="24"/>
+          <w:szCs w:val="24"/>
+        </w:rPr>
+        <w:t xml:space="preserve"> Ltd.</w:t>
+      </w:r>
+    </w:p>
+    <w:p>
+      <w:proofErr w:type="gramStart"/>
       <w:r>
         <w:rPr>
           <w:rFonts w:ascii="Calibri" w:hAnsi="Calibri"/>
@@ -130,7 +179,23 @@
           <w:rFonts w:ascii="Calibri" w:hAnsi="Calibri"/>
           <w:sz w:val="18"/>
         </w:rPr>
-        <w:t>business_address</w:t>
+        <w:t>business</w:t>
+      </w:r>
+      <w:proofErr w:type="gramEnd"/>
+      <w:r>
+        <w:rPr>
+          <w:rFonts w:ascii="Calibri" w:hAnsi="Calibri"/>
+          <w:sz w:val="18"/>
+        </w:rPr>
+        <w:t>_</w:t>
+      </w:r>
+      <w:proofErr w:type="gramStart"/>
+      <w:r>
+        <w:rPr>
+          <w:rFonts w:ascii="Calibri" w:hAnsi="Calibri"/>
+          <w:sz w:val="18"/>
+        </w:rPr>
+        <w:t>address</w:t>
       </w:r>
       <w:proofErr w:type="spellEnd"/>
       <w:r>
@@ -138,10 +203,19 @@
           <w:rFonts w:ascii="Calibri" w:hAnsi="Calibri"/>
           <w:sz w:val="18"/>
         </w:rPr>
-        <w:t xml:space="preserve"> }}</w:t>
+        <w:t xml:space="preserve"> }</w:t>
+      </w:r>
+      <w:proofErr w:type="gramEnd"/>
+      <w:r>
+        <w:rPr>
+          <w:rFonts w:ascii="Calibri" w:hAnsi="Calibri"/>
+          <w:sz w:val="18"/>
+        </w:rPr>
+        <w:t>}</w:t>
       </w:r>
     </w:p>
     <w:p>
+      <w:proofErr w:type="gramStart"/>
       <w:r>
         <w:rPr>
           <w:rFonts w:ascii="Calibri" w:hAnsi="Calibri"/>
@@ -155,7 +229,23 @@
           <w:rFonts w:ascii="Calibri" w:hAnsi="Calibri"/>
           <w:sz w:val="18"/>
         </w:rPr>
-        <w:t>business_phone</w:t>
+        <w:t>business</w:t>
+      </w:r>
+      <w:proofErr w:type="gramEnd"/>
+      <w:r>
+        <w:rPr>
+          <w:rFonts w:ascii="Calibri" w:hAnsi="Calibri"/>
+          <w:sz w:val="18"/>
+        </w:rPr>
+        <w:t>_</w:t>
+      </w:r>
+      <w:proofErr w:type="gramStart"/>
+      <w:r>
+        <w:rPr>
+          <w:rFonts w:ascii="Calibri" w:hAnsi="Calibri"/>
+          <w:sz w:val="18"/>
+        </w:rPr>
+        <w:t>phone</w:t>
       </w:r>
       <w:proofErr w:type="spellEnd"/>
       <w:r>
@@ -163,7 +253,23 @@
           <w:rFonts w:ascii="Calibri" w:hAnsi="Calibri"/>
           <w:sz w:val="18"/>
         </w:rPr>
-        <w:t xml:space="preserve"> }} | {{ </w:t>
+        <w:t xml:space="preserve"> }</w:t>
+      </w:r>
+      <w:proofErr w:type="gramEnd"/>
+      <w:r>
+        <w:rPr>
+          <w:rFonts w:ascii="Calibri" w:hAnsi="Calibri"/>
+          <w:sz w:val="18"/>
+        </w:rPr>
+        <w:t xml:space="preserve">} | </w:t>
+      </w:r>
+      <w:proofErr w:type="gramStart"/>
+      <w:r>
+        <w:rPr>
+          <w:rFonts w:ascii="Calibri" w:hAnsi="Calibri"/>
+          <w:sz w:val="18"/>
+        </w:rPr>
+        <w:t xml:space="preserve">{{ </w:t>
       </w:r>
       <w:proofErr w:type="spellStart"/>
       <w:r>
@@ -171,7 +277,23 @@
           <w:rFonts w:ascii="Calibri" w:hAnsi="Calibri"/>
           <w:sz w:val="18"/>
         </w:rPr>
-        <w:t>business_email</w:t>
+        <w:t>business</w:t>
+      </w:r>
+      <w:proofErr w:type="gramEnd"/>
+      <w:r>
+        <w:rPr>
+          <w:rFonts w:ascii="Calibri" w:hAnsi="Calibri"/>
+          <w:sz w:val="18"/>
+        </w:rPr>
+        <w:t>_</w:t>
+      </w:r>
+      <w:proofErr w:type="gramStart"/>
+      <w:r>
+        <w:rPr>
+          <w:rFonts w:ascii="Calibri" w:hAnsi="Calibri"/>
+          <w:sz w:val="18"/>
+        </w:rPr>
+        <w:t>email</w:t>
       </w:r>
       <w:proofErr w:type="spellEnd"/>
       <w:r>
@@ -179,7 +301,23 @@
           <w:rFonts w:ascii="Calibri" w:hAnsi="Calibri"/>
           <w:sz w:val="18"/>
         </w:rPr>
-        <w:t xml:space="preserve"> }} | {{ </w:t>
+        <w:t xml:space="preserve"> }</w:t>
+      </w:r>
+      <w:proofErr w:type="gramEnd"/>
+      <w:r>
+        <w:rPr>
+          <w:rFonts w:ascii="Calibri" w:hAnsi="Calibri"/>
+          <w:sz w:val="18"/>
+        </w:rPr>
+        <w:t xml:space="preserve">} | </w:t>
+      </w:r>
+      <w:proofErr w:type="gramStart"/>
+      <w:r>
+        <w:rPr>
+          <w:rFonts w:ascii="Calibri" w:hAnsi="Calibri"/>
+          <w:sz w:val="18"/>
+        </w:rPr>
+        <w:t xml:space="preserve">{{ </w:t>
       </w:r>
       <w:proofErr w:type="spellStart"/>
       <w:r>
@@ -187,7 +325,23 @@
           <w:rFonts w:ascii="Calibri" w:hAnsi="Calibri"/>
           <w:sz w:val="18"/>
         </w:rPr>
-        <w:t>business_website</w:t>
+        <w:t>business</w:t>
+      </w:r>
+      <w:proofErr w:type="gramEnd"/>
+      <w:r>
+        <w:rPr>
+          <w:rFonts w:ascii="Calibri" w:hAnsi="Calibri"/>
+          <w:sz w:val="18"/>
+        </w:rPr>
+        <w:t>_</w:t>
+      </w:r>
+      <w:proofErr w:type="gramStart"/>
+      <w:r>
+        <w:rPr>
+          <w:rFonts w:ascii="Calibri" w:hAnsi="Calibri"/>
+          <w:sz w:val="18"/>
+        </w:rPr>
+        <w:t>website</w:t>
       </w:r>
       <w:proofErr w:type="spellEnd"/>
       <w:r>
@@ -195,7 +349,15 @@
           <w:rFonts w:ascii="Calibri" w:hAnsi="Calibri"/>
           <w:sz w:val="18"/>
         </w:rPr>
-        <w:t xml:space="preserve"> }}</w:t>
+        <w:t xml:space="preserve"> }</w:t>
+      </w:r>
+      <w:proofErr w:type="gramEnd"/>
+      <w:r>
+        <w:rPr>
+          <w:rFonts w:ascii="Calibri" w:hAnsi="Calibri"/>
+          <w:sz w:val="18"/>
+        </w:rPr>
+        <w:t>}</w:t>
       </w:r>
     </w:p>
     <w:p>
@@ -862,239 +1024,18 @@
         </w:rPr>
         <w:br w:type="page"/>
       </w:r>
-    </w:p>
-    <w:p>
       <w:r>
         <w:rPr>
           <w:rFonts w:ascii="Calibri" w:hAnsi="Calibri"/>
           <w:b/>
         </w:rPr>
         <w:lastRenderedPageBreak/>
-        <w:t>Dominica VAT Summary:</w:t>
-      </w:r>
-    </w:p>
-    <w:p>
-      <w:r>
-        <w:rPr>
-          <w:rFonts w:ascii="Calibri" w:hAnsi="Calibri"/>
-          <w:sz w:val="20"/>
-        </w:rPr>
-        <w:t xml:space="preserve">Subtotal: </w:t>
-      </w:r>
-      <w:r>
-        <w:rPr>
-          <w:rFonts w:ascii="Calibri" w:hAnsi="Calibri"/>
-          <w:sz w:val="20"/>
-        </w:rPr>
         <w:tab/>
       </w:r>
       <w:r>
         <w:rPr>
           <w:rFonts w:ascii="Calibri" w:hAnsi="Calibri"/>
-          <w:sz w:val="20"/>
-        </w:rPr>
-        <w:tab/>
-      </w:r>
-      <w:proofErr w:type="gramStart"/>
-      <w:r>
-        <w:rPr>
-          <w:rFonts w:ascii="Calibri" w:hAnsi="Calibri"/>
-          <w:sz w:val="20"/>
-        </w:rPr>
-        <w:t xml:space="preserve">{{ </w:t>
-      </w:r>
-      <w:proofErr w:type="spellStart"/>
-      <w:r>
-        <w:rPr>
-          <w:rFonts w:ascii="Calibri" w:hAnsi="Calibri"/>
-          <w:sz w:val="20"/>
-        </w:rPr>
-        <w:t>subtotal</w:t>
-      </w:r>
-      <w:proofErr w:type="gramEnd"/>
-      <w:r>
-        <w:rPr>
-          <w:rFonts w:ascii="Calibri" w:hAnsi="Calibri"/>
-          <w:sz w:val="20"/>
-        </w:rPr>
-        <w:t>_</w:t>
-      </w:r>
-      <w:proofErr w:type="gramStart"/>
-      <w:r>
-        <w:rPr>
-          <w:rFonts w:ascii="Calibri" w:hAnsi="Calibri"/>
-          <w:sz w:val="20"/>
-        </w:rPr>
-        <w:t>net</w:t>
-      </w:r>
-      <w:proofErr w:type="spellEnd"/>
-      <w:r>
-        <w:rPr>
-          <w:rFonts w:ascii="Calibri" w:hAnsi="Calibri"/>
-          <w:sz w:val="20"/>
-        </w:rPr>
-        <w:t xml:space="preserve"> }</w:t>
-      </w:r>
-      <w:proofErr w:type="gramEnd"/>
-      <w:r>
-        <w:rPr>
-          <w:rFonts w:ascii="Calibri" w:hAnsi="Calibri"/>
-          <w:sz w:val="20"/>
-        </w:rPr>
-        <w:t>}</w:t>
-      </w:r>
-    </w:p>
-    <w:p>
-      <w:r>
-        <w:rPr>
-          <w:rFonts w:ascii="Calibri" w:hAnsi="Calibri"/>
-          <w:sz w:val="20"/>
-        </w:rPr>
-        <w:t xml:space="preserve">Accommodation VAT: </w:t>
-      </w:r>
-      <w:r>
-        <w:rPr>
-          <w:rFonts w:ascii="Calibri" w:hAnsi="Calibri"/>
-          <w:sz w:val="20"/>
-        </w:rPr>
-        <w:tab/>
-      </w:r>
-      <w:proofErr w:type="gramStart"/>
-      <w:r>
-        <w:rPr>
-          <w:rFonts w:ascii="Calibri" w:hAnsi="Calibri"/>
-          <w:sz w:val="20"/>
-        </w:rPr>
-        <w:t xml:space="preserve">{{ </w:t>
-      </w:r>
-      <w:proofErr w:type="spellStart"/>
-      <w:r>
-        <w:rPr>
-          <w:rFonts w:ascii="Calibri" w:hAnsi="Calibri"/>
-          <w:sz w:val="20"/>
-        </w:rPr>
-        <w:t>accommodation</w:t>
-      </w:r>
-      <w:proofErr w:type="gramEnd"/>
-      <w:r>
-        <w:rPr>
-          <w:rFonts w:ascii="Calibri" w:hAnsi="Calibri"/>
-          <w:sz w:val="20"/>
-        </w:rPr>
-        <w:t>_vat_</w:t>
-      </w:r>
-      <w:proofErr w:type="gramStart"/>
-      <w:r>
-        <w:rPr>
-          <w:rFonts w:ascii="Calibri" w:hAnsi="Calibri"/>
-          <w:sz w:val="20"/>
-        </w:rPr>
-        <w:t>formula</w:t>
-      </w:r>
-      <w:proofErr w:type="spellEnd"/>
-      <w:r>
-        <w:rPr>
-          <w:rFonts w:ascii="Calibri" w:hAnsi="Calibri"/>
-          <w:sz w:val="20"/>
-        </w:rPr>
-        <w:t xml:space="preserve"> }</w:t>
-      </w:r>
-      <w:proofErr w:type="gramEnd"/>
-      <w:r>
-        <w:rPr>
-          <w:rFonts w:ascii="Calibri" w:hAnsi="Calibri"/>
-          <w:sz w:val="20"/>
-        </w:rPr>
-        <w:t>}</w:t>
-      </w:r>
-    </w:p>
-    <w:p>
-      <w:r>
-        <w:rPr>
-          <w:rFonts w:ascii="Calibri" w:hAnsi="Calibri"/>
-          <w:sz w:val="20"/>
-        </w:rPr>
-        <w:t xml:space="preserve">Services VAT: </w:t>
-      </w:r>
-      <w:r>
-        <w:rPr>
-          <w:rFonts w:ascii="Calibri" w:hAnsi="Calibri"/>
-          <w:sz w:val="20"/>
-        </w:rPr>
-        <w:tab/>
-      </w:r>
-      <w:r>
-        <w:rPr>
-          <w:rFonts w:ascii="Calibri" w:hAnsi="Calibri"/>
-          <w:sz w:val="20"/>
-        </w:rPr>
-        <w:tab/>
-      </w:r>
-      <w:proofErr w:type="gramStart"/>
-      <w:r>
-        <w:rPr>
-          <w:rFonts w:ascii="Calibri" w:hAnsi="Calibri"/>
-          <w:sz w:val="20"/>
-        </w:rPr>
-        <w:t xml:space="preserve">{{ </w:t>
-      </w:r>
-      <w:proofErr w:type="spellStart"/>
-      <w:r>
-        <w:rPr>
-          <w:rFonts w:ascii="Calibri" w:hAnsi="Calibri"/>
-          <w:sz w:val="20"/>
-        </w:rPr>
-        <w:t>services</w:t>
-      </w:r>
-      <w:proofErr w:type="gramEnd"/>
-      <w:r>
-        <w:rPr>
-          <w:rFonts w:ascii="Calibri" w:hAnsi="Calibri"/>
-          <w:sz w:val="20"/>
-        </w:rPr>
-        <w:t>_vat_</w:t>
-      </w:r>
-      <w:proofErr w:type="gramStart"/>
-      <w:r>
-        <w:rPr>
-          <w:rFonts w:ascii="Calibri" w:hAnsi="Calibri"/>
-          <w:sz w:val="20"/>
-        </w:rPr>
-        <w:t>formula</w:t>
-      </w:r>
-      <w:proofErr w:type="spellEnd"/>
-      <w:r>
-        <w:rPr>
-          <w:rFonts w:ascii="Calibri" w:hAnsi="Calibri"/>
-          <w:sz w:val="20"/>
-        </w:rPr>
-        <w:t xml:space="preserve"> }</w:t>
-      </w:r>
-      <w:proofErr w:type="gramEnd"/>
-      <w:r>
-        <w:rPr>
-          <w:rFonts w:ascii="Calibri" w:hAnsi="Calibri"/>
-          <w:sz w:val="20"/>
-        </w:rPr>
-        <w:t>}</w:t>
-      </w:r>
-    </w:p>
-    <w:p>
-      <w:r>
-        <w:rPr>
-          <w:rFonts w:ascii="Calibri" w:hAnsi="Calibri"/>
           <w:b/>
-          <w:color w:val="0B6B6B"/>
-          <w:sz w:val="20"/>
-        </w:rPr>
-        <w:t xml:space="preserve">Total VAT: </w:t>
-      </w:r>
-      <w:r>
-        <w:rPr>
-          <w:rFonts w:ascii="Calibri" w:hAnsi="Calibri"/>
-          <w:b/>
-          <w:color w:val="0B6B6B"/>
-          <w:sz w:val="20"/>
         </w:rPr>
         <w:tab/>
       </w:r>
@@ -1102,74 +1043,400 @@
         <w:rPr>
           <w:rFonts w:ascii="Calibri" w:hAnsi="Calibri"/>
           <w:b/>
-          <w:color w:val="0B6B6B"/>
-          <w:sz w:val="20"/>
         </w:rPr>
         <w:tab/>
       </w:r>
-      <w:proofErr w:type="gramStart"/>
       <w:r>
         <w:rPr>
           <w:rFonts w:ascii="Calibri" w:hAnsi="Calibri"/>
           <w:b/>
-          <w:color w:val="0B6B6B"/>
-          <w:sz w:val="20"/>
         </w:rPr>
-        <w:t xml:space="preserve">{{ </w:t>
+        <w:tab/>
       </w:r>
-      <w:proofErr w:type="spellStart"/>
       <w:r>
         <w:rPr>
           <w:rFonts w:ascii="Calibri" w:hAnsi="Calibri"/>
           <w:b/>
-          <w:color w:val="0B6B6B"/>
-          <w:sz w:val="20"/>
         </w:rPr>
-        <w:t>total</w:t>
+        <w:tab/>
       </w:r>
-      <w:proofErr w:type="gramEnd"/>
       <w:r>
         <w:rPr>
           <w:rFonts w:ascii="Calibri" w:hAnsi="Calibri"/>
           <w:b/>
-          <w:color w:val="0B6B6B"/>
-          <w:sz w:val="20"/>
         </w:rPr>
-        <w:t>_</w:t>
-      </w:r>
-      <w:proofErr w:type="gramStart"/>
-      <w:r>
-        <w:rPr>
-          <w:rFonts w:ascii="Calibri" w:hAnsi="Calibri"/>
-          <w:b/>
-          <w:color w:val="0B6B6B"/>
-          <w:sz w:val="20"/>
-        </w:rPr>
-        <w:t>vat</w:t>
-      </w:r>
-      <w:proofErr w:type="spellEnd"/>
-      <w:r>
-        <w:rPr>
-          <w:rFonts w:ascii="Calibri" w:hAnsi="Calibri"/>
-          <w:b/>
-          <w:color w:val="0B6B6B"/>
-          <w:sz w:val="20"/>
-        </w:rPr>
-        <w:t xml:space="preserve"> }</w:t>
-      </w:r>
-      <w:proofErr w:type="gramEnd"/>
-      <w:r>
-        <w:rPr>
-          <w:rFonts w:ascii="Calibri" w:hAnsi="Calibri"/>
-          <w:b/>
-          <w:color w:val="0B6B6B"/>
-          <w:sz w:val="20"/>
-        </w:rPr>
-        <w:t>}</w:t>
+        <w:t>Dominica VAT Summary:</w:t>
       </w:r>
     </w:p>
+    <w:tbl>
+      <w:tblPr>
+        <w:tblStyle w:val="TableGrid"/>
+        <w:tblW w:w="0" w:type="auto"/>
+        <w:tblInd w:w="3595" w:type="dxa"/>
+        <w:tblLook w:val="04A0" w:firstRow="1" w:lastRow="0" w:firstColumn="1" w:lastColumn="0" w:noHBand="0" w:noVBand="1"/>
+      </w:tblPr>
+      <w:tblGrid>
+        <w:gridCol w:w="4050"/>
+        <w:gridCol w:w="3145"/>
+      </w:tblGrid>
+      <w:tr>
+        <w:tc>
+          <w:tcPr>
+            <w:tcW w:w="4050" w:type="dxa"/>
+          </w:tcPr>
+          <w:p>
+            <w:r>
+              <w:rPr>
+                <w:rFonts w:ascii="Calibri" w:hAnsi="Calibri"/>
+                <w:sz w:val="20"/>
+              </w:rPr>
+              <w:t xml:space="preserve">Subtotal: </w:t>
+            </w:r>
+            <w:r>
+              <w:rPr>
+                <w:rFonts w:ascii="Calibri" w:hAnsi="Calibri"/>
+                <w:sz w:val="20"/>
+              </w:rPr>
+              <w:tab/>
+            </w:r>
+            <w:r>
+              <w:rPr>
+                <w:rFonts w:ascii="Calibri" w:hAnsi="Calibri"/>
+                <w:sz w:val="20"/>
+              </w:rPr>
+              <w:tab/>
+            </w:r>
+            <w:r>
+              <w:rPr>
+                <w:rFonts w:ascii="Calibri" w:hAnsi="Calibri"/>
+                <w:sz w:val="20"/>
+              </w:rPr>
+              <w:tab/>
+            </w:r>
+            <w:r>
+              <w:rPr>
+                <w:rFonts w:ascii="Calibri" w:hAnsi="Calibri"/>
+                <w:sz w:val="20"/>
+              </w:rPr>
+              <w:tab/>
+            </w:r>
+          </w:p>
+        </w:tc>
+        <w:tc>
+          <w:tcPr>
+            <w:tcW w:w="3145" w:type="dxa"/>
+          </w:tcPr>
+          <w:p>
+            <w:pPr>
+              <w:jc w:val="right"/>
+              <w:rPr>
+                <w:rFonts w:ascii="Calibri" w:hAnsi="Calibri"/>
+                <w:sz w:val="20"/>
+              </w:rPr>
+            </w:pPr>
+            <w:proofErr w:type="gramStart"/>
+            <w:r>
+              <w:rPr>
+                <w:rFonts w:ascii="Calibri" w:hAnsi="Calibri"/>
+                <w:sz w:val="20"/>
+              </w:rPr>
+              <w:t xml:space="preserve">{{ </w:t>
+            </w:r>
+            <w:proofErr w:type="spellStart"/>
+            <w:r>
+              <w:rPr>
+                <w:rFonts w:ascii="Calibri" w:hAnsi="Calibri"/>
+                <w:sz w:val="20"/>
+              </w:rPr>
+              <w:t>subtotal</w:t>
+            </w:r>
+            <w:proofErr w:type="gramEnd"/>
+            <w:r>
+              <w:rPr>
+                <w:rFonts w:ascii="Calibri" w:hAnsi="Calibri"/>
+                <w:sz w:val="20"/>
+              </w:rPr>
+              <w:t>_net</w:t>
+            </w:r>
+            <w:proofErr w:type="spellEnd"/>
+            <w:r>
+              <w:rPr>
+                <w:rFonts w:ascii="Calibri" w:hAnsi="Calibri"/>
+                <w:sz w:val="20"/>
+              </w:rPr>
+              <w:t xml:space="preserve"> }}</w:t>
+            </w:r>
+          </w:p>
+        </w:tc>
+      </w:tr>
+      <w:tr>
+        <w:tc>
+          <w:tcPr>
+            <w:tcW w:w="4050" w:type="dxa"/>
+          </w:tcPr>
+          <w:p>
+            <w:r>
+              <w:rPr>
+                <w:rFonts w:ascii="Calibri" w:hAnsi="Calibri"/>
+                <w:sz w:val="20"/>
+              </w:rPr>
+              <w:t xml:space="preserve">Accommodation VAT: </w:t>
+            </w:r>
+            <w:r>
+              <w:rPr>
+                <w:rFonts w:ascii="Calibri" w:hAnsi="Calibri"/>
+                <w:sz w:val="20"/>
+              </w:rPr>
+              <w:tab/>
+            </w:r>
+          </w:p>
+        </w:tc>
+        <w:tc>
+          <w:tcPr>
+            <w:tcW w:w="3145" w:type="dxa"/>
+          </w:tcPr>
+          <w:p>
+            <w:pPr>
+              <w:jc w:val="right"/>
+              <w:rPr>
+                <w:rFonts w:ascii="Calibri" w:hAnsi="Calibri"/>
+                <w:sz w:val="20"/>
+              </w:rPr>
+            </w:pPr>
+            <w:proofErr w:type="gramStart"/>
+            <w:r>
+              <w:rPr>
+                <w:rFonts w:ascii="Calibri" w:hAnsi="Calibri"/>
+                <w:sz w:val="20"/>
+              </w:rPr>
+              <w:t xml:space="preserve">{{ </w:t>
+            </w:r>
+            <w:proofErr w:type="spellStart"/>
+            <w:r>
+              <w:rPr>
+                <w:rFonts w:ascii="Calibri" w:hAnsi="Calibri"/>
+                <w:sz w:val="20"/>
+              </w:rPr>
+              <w:t>accommodation</w:t>
+            </w:r>
+            <w:proofErr w:type="gramEnd"/>
+            <w:r>
+              <w:rPr>
+                <w:rFonts w:ascii="Calibri" w:hAnsi="Calibri"/>
+                <w:sz w:val="20"/>
+              </w:rPr>
+              <w:t>_vat_formula</w:t>
+            </w:r>
+            <w:proofErr w:type="spellEnd"/>
+            <w:r>
+              <w:rPr>
+                <w:rFonts w:ascii="Calibri" w:hAnsi="Calibri"/>
+                <w:sz w:val="20"/>
+              </w:rPr>
+              <w:t xml:space="preserve"> }}</w:t>
+            </w:r>
+          </w:p>
+        </w:tc>
+      </w:tr>
+      <w:tr>
+        <w:tc>
+          <w:tcPr>
+            <w:tcW w:w="4050" w:type="dxa"/>
+          </w:tcPr>
+          <w:p>
+            <w:r>
+              <w:rPr>
+                <w:rFonts w:ascii="Calibri" w:hAnsi="Calibri"/>
+                <w:sz w:val="20"/>
+              </w:rPr>
+              <w:t xml:space="preserve">Services VAT: </w:t>
+            </w:r>
+            <w:r>
+              <w:rPr>
+                <w:rFonts w:ascii="Calibri" w:hAnsi="Calibri"/>
+                <w:sz w:val="20"/>
+              </w:rPr>
+              <w:tab/>
+            </w:r>
+            <w:r>
+              <w:rPr>
+                <w:rFonts w:ascii="Calibri" w:hAnsi="Calibri"/>
+                <w:sz w:val="20"/>
+              </w:rPr>
+              <w:tab/>
+            </w:r>
+            <w:r>
+              <w:rPr>
+                <w:rFonts w:ascii="Calibri" w:hAnsi="Calibri"/>
+                <w:sz w:val="20"/>
+              </w:rPr>
+              <w:tab/>
+            </w:r>
+          </w:p>
+        </w:tc>
+        <w:tc>
+          <w:tcPr>
+            <w:tcW w:w="3145" w:type="dxa"/>
+          </w:tcPr>
+          <w:p>
+            <w:pPr>
+              <w:jc w:val="right"/>
+              <w:rPr>
+                <w:rFonts w:ascii="Calibri" w:hAnsi="Calibri"/>
+                <w:sz w:val="20"/>
+              </w:rPr>
+            </w:pPr>
+            <w:proofErr w:type="gramStart"/>
+            <w:r>
+              <w:rPr>
+                <w:rFonts w:ascii="Calibri" w:hAnsi="Calibri"/>
+                <w:sz w:val="20"/>
+              </w:rPr>
+              <w:t xml:space="preserve">{{ </w:t>
+            </w:r>
+            <w:proofErr w:type="spellStart"/>
+            <w:r>
+              <w:rPr>
+                <w:rFonts w:ascii="Calibri" w:hAnsi="Calibri"/>
+                <w:sz w:val="20"/>
+              </w:rPr>
+              <w:t>services</w:t>
+            </w:r>
+            <w:proofErr w:type="gramEnd"/>
+            <w:r>
+              <w:rPr>
+                <w:rFonts w:ascii="Calibri" w:hAnsi="Calibri"/>
+                <w:sz w:val="20"/>
+              </w:rPr>
+              <w:t>_vat_formula</w:t>
+            </w:r>
+            <w:proofErr w:type="spellEnd"/>
+            <w:r>
+              <w:rPr>
+                <w:rFonts w:ascii="Calibri" w:hAnsi="Calibri"/>
+                <w:sz w:val="20"/>
+              </w:rPr>
+              <w:t xml:space="preserve"> }}</w:t>
+            </w:r>
+          </w:p>
+        </w:tc>
+      </w:tr>
+      <w:tr>
+        <w:tc>
+          <w:tcPr>
+            <w:tcW w:w="4050" w:type="dxa"/>
+          </w:tcPr>
+          <w:p>
+            <w:r>
+              <w:rPr>
+                <w:rFonts w:ascii="Calibri" w:hAnsi="Calibri"/>
+                <w:b/>
+                <w:color w:val="0B6B6B"/>
+                <w:sz w:val="20"/>
+              </w:rPr>
+              <w:t xml:space="preserve">Total VAT: </w:t>
+            </w:r>
+            <w:r>
+              <w:rPr>
+                <w:rFonts w:ascii="Calibri" w:hAnsi="Calibri"/>
+                <w:b/>
+                <w:color w:val="0B6B6B"/>
+                <w:sz w:val="20"/>
+              </w:rPr>
+              <w:tab/>
+            </w:r>
+            <w:r>
+              <w:rPr>
+                <w:rFonts w:ascii="Calibri" w:hAnsi="Calibri"/>
+                <w:b/>
+                <w:color w:val="0B6B6B"/>
+                <w:sz w:val="20"/>
+              </w:rPr>
+              <w:tab/>
+            </w:r>
+            <w:r>
+              <w:rPr>
+                <w:rFonts w:ascii="Calibri" w:hAnsi="Calibri"/>
+                <w:b/>
+                <w:color w:val="0B6B6B"/>
+                <w:sz w:val="20"/>
+              </w:rPr>
+              <w:tab/>
+            </w:r>
+            <w:r>
+              <w:rPr>
+                <w:rFonts w:ascii="Calibri" w:hAnsi="Calibri"/>
+                <w:b/>
+                <w:color w:val="0B6B6B"/>
+                <w:sz w:val="20"/>
+              </w:rPr>
+              <w:tab/>
+            </w:r>
+          </w:p>
+        </w:tc>
+        <w:tc>
+          <w:tcPr>
+            <w:tcW w:w="3145" w:type="dxa"/>
+          </w:tcPr>
+          <w:p>
+            <w:pPr>
+              <w:jc w:val="right"/>
+              <w:rPr>
+                <w:rFonts w:ascii="Calibri" w:hAnsi="Calibri"/>
+                <w:b/>
+                <w:color w:val="0B6B6B"/>
+                <w:sz w:val="20"/>
+              </w:rPr>
+            </w:pPr>
+            <w:proofErr w:type="gramStart"/>
+            <w:r>
+              <w:rPr>
+                <w:rFonts w:ascii="Calibri" w:hAnsi="Calibri"/>
+                <w:b/>
+                <w:color w:val="0B6B6B"/>
+                <w:sz w:val="20"/>
+              </w:rPr>
+              <w:t xml:space="preserve">{{ </w:t>
+            </w:r>
+            <w:proofErr w:type="spellStart"/>
+            <w:r>
+              <w:rPr>
+                <w:rFonts w:ascii="Calibri" w:hAnsi="Calibri"/>
+                <w:b/>
+                <w:color w:val="0B6B6B"/>
+                <w:sz w:val="20"/>
+              </w:rPr>
+              <w:t>total</w:t>
+            </w:r>
+            <w:proofErr w:type="gramEnd"/>
+            <w:r>
+              <w:rPr>
+                <w:rFonts w:ascii="Calibri" w:hAnsi="Calibri"/>
+                <w:b/>
+                <w:color w:val="0B6B6B"/>
+                <w:sz w:val="20"/>
+              </w:rPr>
+              <w:t>_vat</w:t>
+            </w:r>
+            <w:proofErr w:type="spellEnd"/>
+            <w:r>
+              <w:rPr>
+                <w:rFonts w:ascii="Calibri" w:hAnsi="Calibri"/>
+                <w:b/>
+                <w:color w:val="0B6B6B"/>
+                <w:sz w:val="20"/>
+              </w:rPr>
+              <w:t xml:space="preserve"> }}</w:t>
+            </w:r>
+          </w:p>
+        </w:tc>
+      </w:tr>
+    </w:tbl>
     <w:p/>
     <w:p>
+      <w:pPr>
+        <w:ind w:left="3600"/>
+      </w:pPr>
       <w:r>
         <w:rPr>
           <w:rFonts w:ascii="Calibri" w:hAnsi="Calibri"/>
@@ -1182,26 +1449,35 @@
       <w:tblPr>
         <w:tblStyle w:val="TableGrid"/>
         <w:tblW w:w="0" w:type="auto"/>
+        <w:tblInd w:w="3595" w:type="dxa"/>
         <w:tblLook w:val="04A0" w:firstRow="1" w:lastRow="0" w:firstColumn="1" w:lastColumn="0" w:noHBand="0" w:noVBand="1"/>
       </w:tblPr>
       <w:tblGrid>
-        <w:gridCol w:w="5395"/>
-        <w:gridCol w:w="5395"/>
+        <w:gridCol w:w="4590"/>
+        <w:gridCol w:w="2605"/>
       </w:tblGrid>
       <w:tr>
         <w:tc>
           <w:tcPr>
-            <w:tcW w:w="5400" w:type="dxa"/>
+            <w:tcW w:w="4590" w:type="dxa"/>
           </w:tcPr>
           <w:p>
             <w:r>
-              <w:t>{%tr for payment in payments[:4] %}</w:t>
+              <w:t xml:space="preserve">{%tr for payment in </w:t>
+            </w:r>
+            <w:proofErr w:type="gramStart"/>
+            <w:r>
+              <w:t>payments[</w:t>
+            </w:r>
+            <w:proofErr w:type="gramEnd"/>
+            <w:r>
+              <w:t>:4] %}</w:t>
             </w:r>
           </w:p>
         </w:tc>
         <w:tc>
           <w:tcPr>
-            <w:tcW w:w="5400" w:type="dxa"/>
+            <w:tcW w:w="2605" w:type="dxa"/>
           </w:tcPr>
           <w:p/>
         </w:tc>
@@ -1209,7 +1485,7 @@
       <w:tr>
         <w:tc>
           <w:tcPr>
-            <w:tcW w:w="5400" w:type="dxa"/>
+            <w:tcW w:w="4590" w:type="dxa"/>
           </w:tcPr>
           <w:p>
             <w:r>
@@ -1227,7 +1503,7 @@
         </w:tc>
         <w:tc>
           <w:tcPr>
-            <w:tcW w:w="5400" w:type="dxa"/>
+            <w:tcW w:w="2605" w:type="dxa"/>
           </w:tcPr>
           <w:p>
             <w:pPr>
@@ -1250,7 +1526,7 @@
       <w:tr>
         <w:tc>
           <w:tcPr>
-            <w:tcW w:w="5400" w:type="dxa"/>
+            <w:tcW w:w="4590" w:type="dxa"/>
           </w:tcPr>
           <w:p>
             <w:r>
@@ -1268,7 +1544,7 @@
         </w:tc>
         <w:tc>
           <w:tcPr>
-            <w:tcW w:w="5400" w:type="dxa"/>
+            <w:tcW w:w="2605" w:type="dxa"/>
           </w:tcPr>
           <w:p/>
         </w:tc>
@@ -1276,7 +1552,7 @@
       <w:tr>
         <w:tc>
           <w:tcPr>
-            <w:tcW w:w="5400" w:type="dxa"/>
+            <w:tcW w:w="4590" w:type="dxa"/>
           </w:tcPr>
           <w:p>
             <w:r>
@@ -1286,7 +1562,7 @@
         </w:tc>
         <w:tc>
           <w:tcPr>
-            <w:tcW w:w="5400" w:type="dxa"/>
+            <w:tcW w:w="2605" w:type="dxa"/>
           </w:tcPr>
           <w:p>
             <w:pPr>

</xml_diff>

<commit_message>
design(invoice): compact Word invoice layout
</commit_message>
<xml_diff>
--- a/invoice_template.docx
+++ b/invoice_template.docx
@@ -385,7 +385,6 @@
         <w:t xml:space="preserve"> }}</w:t>
       </w:r>
     </w:p>
-    <w:p/>
     <w:p>
       <w:r>
         <w:rPr>
@@ -428,7 +427,6 @@
         <w:t xml:space="preserve"> }}</w:t>
       </w:r>
     </w:p>
-    <w:p/>
     <w:tbl>
       <w:tblPr>
         <w:tblStyle w:val="TableGrid"/>
@@ -442,7 +440,7 @@
       <w:tr>
         <w:tc>
           <w:tcPr>
-            <w:tcW w:w="5400" w:type="dxa"/>
+            <w:tcW w:w="5395" w:type="dxa"/>
           </w:tcPr>
           <w:p>
             <w:r>
@@ -452,7 +450,7 @@
         </w:tc>
         <w:tc>
           <w:tcPr>
-            <w:tcW w:w="5400" w:type="dxa"/>
+            <w:tcW w:w="5395" w:type="dxa"/>
           </w:tcPr>
           <w:p>
             <w:r>
@@ -472,7 +470,7 @@
       <w:tr>
         <w:tc>
           <w:tcPr>
-            <w:tcW w:w="5400" w:type="dxa"/>
+            <w:tcW w:w="5395" w:type="dxa"/>
           </w:tcPr>
           <w:p>
             <w:r>
@@ -482,7 +480,7 @@
         </w:tc>
         <w:tc>
           <w:tcPr>
-            <w:tcW w:w="5400" w:type="dxa"/>
+            <w:tcW w:w="5395" w:type="dxa"/>
           </w:tcPr>
           <w:p>
             <w:r>
@@ -502,7 +500,7 @@
       <w:tr>
         <w:tc>
           <w:tcPr>
-            <w:tcW w:w="5400" w:type="dxa"/>
+            <w:tcW w:w="5395" w:type="dxa"/>
           </w:tcPr>
           <w:p>
             <w:r>
@@ -512,7 +510,7 @@
         </w:tc>
         <w:tc>
           <w:tcPr>
-            <w:tcW w:w="5400" w:type="dxa"/>
+            <w:tcW w:w="5395" w:type="dxa"/>
           </w:tcPr>
           <w:p>
             <w:r>
@@ -524,7 +522,7 @@
       <w:tr>
         <w:tc>
           <w:tcPr>
-            <w:tcW w:w="5400" w:type="dxa"/>
+            <w:tcW w:w="5395" w:type="dxa"/>
           </w:tcPr>
           <w:p>
             <w:r>
@@ -534,7 +532,7 @@
         </w:tc>
         <w:tc>
           <w:tcPr>
-            <w:tcW w:w="5400" w:type="dxa"/>
+            <w:tcW w:w="5395" w:type="dxa"/>
           </w:tcPr>
           <w:p>
             <w:r>
@@ -586,123 +584,173 @@
         </w:rPr>
         <w:t>PACKAGE INFORMATION</w:t>
       </w:r>
-    </w:p>
-    <w:p>
-      <w:r>
-        <w:rPr>
-          <w:rFonts w:ascii="Calibri" w:hAnsi="Calibri"/>
-          <w:sz w:val="20"/>
-        </w:rPr>
-        <w:t xml:space="preserve">Stay: {{ </w:t>
-      </w:r>
-      <w:proofErr w:type="spellStart"/>
-      <w:r>
-        <w:rPr>
-          <w:rFonts w:ascii="Calibri" w:hAnsi="Calibri"/>
-          <w:sz w:val="20"/>
-        </w:rPr>
-        <w:t>check_in</w:t>
-      </w:r>
-      <w:proofErr w:type="spellEnd"/>
-      <w:r>
-        <w:rPr>
-          <w:rFonts w:ascii="Calibri" w:hAnsi="Calibri"/>
-          <w:sz w:val="20"/>
-        </w:rPr>
-        <w:t xml:space="preserve"> }} to {{ </w:t>
-      </w:r>
-      <w:proofErr w:type="spellStart"/>
-      <w:r>
-        <w:rPr>
-          <w:rFonts w:ascii="Calibri" w:hAnsi="Calibri"/>
-          <w:sz w:val="20"/>
-        </w:rPr>
-        <w:t>check_out</w:t>
-      </w:r>
-      <w:proofErr w:type="spellEnd"/>
-      <w:r>
-        <w:rPr>
-          <w:rFonts w:ascii="Calibri" w:hAnsi="Calibri"/>
-          <w:sz w:val="20"/>
-        </w:rPr>
-        <w:t xml:space="preserve"> }}</w:t>
-      </w:r>
-    </w:p>
-    <w:p>
-      <w:r>
-        <w:rPr>
-          <w:rFonts w:ascii="Calibri" w:hAnsi="Calibri"/>
-          <w:sz w:val="20"/>
-        </w:rPr>
-        <w:t xml:space="preserve">Package: {{ </w:t>
-      </w:r>
-      <w:proofErr w:type="spellStart"/>
-      <w:r>
-        <w:rPr>
-          <w:rFonts w:ascii="Calibri" w:hAnsi="Calibri"/>
-          <w:sz w:val="20"/>
-        </w:rPr>
-        <w:t>package_title</w:t>
-      </w:r>
-      <w:proofErr w:type="spellEnd"/>
-      <w:r>
-        <w:rPr>
-          <w:rFonts w:ascii="Calibri" w:hAnsi="Calibri"/>
-          <w:sz w:val="20"/>
-        </w:rPr>
-        <w:t xml:space="preserve"> }}</w:t>
-      </w:r>
-    </w:p>
-    <w:p>
-      <w:r>
-        <w:rPr>
-          <w:rFonts w:ascii="Calibri" w:hAnsi="Calibri"/>
-          <w:sz w:val="20"/>
-        </w:rPr>
-        <w:t xml:space="preserve">Total Guests: {{ </w:t>
-      </w:r>
-      <w:proofErr w:type="spellStart"/>
-      <w:r>
-        <w:rPr>
-          <w:rFonts w:ascii="Calibri" w:hAnsi="Calibri"/>
-          <w:sz w:val="20"/>
-        </w:rPr>
-        <w:t>total_guests</w:t>
-      </w:r>
-      <w:proofErr w:type="spellEnd"/>
-      <w:r>
-        <w:rPr>
-          <w:rFonts w:ascii="Calibri" w:hAnsi="Calibri"/>
-          <w:sz w:val="20"/>
-        </w:rPr>
-        <w:t xml:space="preserve"> }}</w:t>
-      </w:r>
-    </w:p>
-    <w:p/>
-    <w:p>
       <w:r>
         <w:rPr>
           <w:rFonts w:ascii="Calibri" w:hAnsi="Calibri"/>
           <w:b/>
           <w:sz w:val="24"/>
         </w:rPr>
-        <w:t>Financial Summary</w:t>
+        <w:tab/>
+      </w:r>
+      <w:r>
+        <w:rPr>
+          <w:rFonts w:ascii="Calibri" w:hAnsi="Calibri"/>
+          <w:b/>
+          <w:sz w:val="24"/>
+        </w:rPr>
+        <w:tab/>
+      </w:r>
+      <w:r>
+        <w:rPr>
+          <w:rFonts w:ascii="Calibri" w:hAnsi="Calibri"/>
+          <w:b/>
+          <w:sz w:val="24"/>
+        </w:rPr>
+        <w:tab/>
+      </w:r>
+      <w:r>
+        <w:rPr>
+          <w:rFonts w:ascii="Calibri" w:hAnsi="Calibri"/>
+          <w:b/>
+          <w:sz w:val="24"/>
+        </w:rPr>
+        <w:tab/>
+      </w:r>
+      <w:r>
+        <w:rPr>
+          <w:rFonts w:ascii="Calibri" w:hAnsi="Calibri"/>
+          <w:b/>
+          <w:sz w:val="24"/>
+        </w:rPr>
+        <w:tab/>
+      </w:r>
+      <w:r>
+        <w:rPr>
+          <w:rFonts w:ascii="Calibri" w:hAnsi="Calibri"/>
+          <w:b/>
+          <w:sz w:val="24"/>
+        </w:rPr>
+        <w:tab/>
+      </w:r>
+      <w:r>
+        <w:rPr>
+          <w:rFonts w:ascii="Calibri" w:hAnsi="Calibri"/>
+          <w:b/>
+          <w:sz w:val="24"/>
+        </w:rPr>
+        <w:t>FINANCIAL SUMMARY</w:t>
       </w:r>
     </w:p>
     <w:tbl>
       <w:tblPr>
         <w:tblStyle w:val="TableGrid"/>
         <w:tblW w:w="0" w:type="auto"/>
+        <w:tblInd w:w="-5" w:type="dxa"/>
         <w:tblLook w:val="04A0" w:firstRow="1" w:lastRow="0" w:firstColumn="1" w:lastColumn="0" w:noHBand="0" w:noVBand="1"/>
       </w:tblPr>
       <w:tblGrid>
-        <w:gridCol w:w="5395"/>
-        <w:gridCol w:w="5395"/>
+        <w:gridCol w:w="4032"/>
+        <w:gridCol w:w="3420"/>
+        <w:gridCol w:w="2695"/>
       </w:tblGrid>
       <w:tr>
         <w:tc>
           <w:tcPr>
-            <w:tcW w:w="5400" w:type="dxa"/>
+            <w:tcW w:w="4032" w:type="dxa"/>
+          </w:tcPr>
+          <w:p>
+            <w:r>
+              <w:rPr>
+                <w:rFonts w:ascii="Calibri" w:hAnsi="Calibri"/>
+                <w:sz w:val="20"/>
+              </w:rPr>
+              <w:t xml:space="preserve">Stay: </w:t>
+            </w:r>
+            <w:proofErr w:type="gramStart"/>
+            <w:r>
+              <w:rPr>
+                <w:rFonts w:ascii="Calibri" w:hAnsi="Calibri"/>
+                <w:sz w:val="20"/>
+              </w:rPr>
+              <w:t xml:space="preserve">{{ </w:t>
+            </w:r>
+            <w:proofErr w:type="spellStart"/>
+            <w:r>
+              <w:rPr>
+                <w:rFonts w:ascii="Calibri" w:hAnsi="Calibri"/>
+                <w:sz w:val="20"/>
+              </w:rPr>
+              <w:t>check</w:t>
+            </w:r>
+            <w:proofErr w:type="gramEnd"/>
+            <w:r>
+              <w:rPr>
+                <w:rFonts w:ascii="Calibri" w:hAnsi="Calibri"/>
+                <w:sz w:val="20"/>
+              </w:rPr>
+              <w:t>_</w:t>
+            </w:r>
+            <w:proofErr w:type="gramStart"/>
+            <w:r>
+              <w:rPr>
+                <w:rFonts w:ascii="Calibri" w:hAnsi="Calibri"/>
+                <w:sz w:val="20"/>
+              </w:rPr>
+              <w:t>in</w:t>
+            </w:r>
+            <w:proofErr w:type="spellEnd"/>
+            <w:r>
+              <w:rPr>
+                <w:rFonts w:ascii="Calibri" w:hAnsi="Calibri"/>
+                <w:sz w:val="20"/>
+              </w:rPr>
+              <w:t xml:space="preserve"> }</w:t>
+            </w:r>
+            <w:proofErr w:type="gramEnd"/>
+            <w:r>
+              <w:rPr>
+                <w:rFonts w:ascii="Calibri" w:hAnsi="Calibri"/>
+                <w:sz w:val="20"/>
+              </w:rPr>
+              <w:t xml:space="preserve">} to </w:t>
+            </w:r>
+            <w:proofErr w:type="gramStart"/>
+            <w:r>
+              <w:rPr>
+                <w:rFonts w:ascii="Calibri" w:hAnsi="Calibri"/>
+                <w:sz w:val="20"/>
+              </w:rPr>
+              <w:t xml:space="preserve">{{ </w:t>
+            </w:r>
+            <w:proofErr w:type="spellStart"/>
+            <w:r>
+              <w:rPr>
+                <w:rFonts w:ascii="Calibri" w:hAnsi="Calibri"/>
+                <w:sz w:val="20"/>
+              </w:rPr>
+              <w:t>check</w:t>
+            </w:r>
+            <w:proofErr w:type="gramEnd"/>
+            <w:r>
+              <w:rPr>
+                <w:rFonts w:ascii="Calibri" w:hAnsi="Calibri"/>
+                <w:sz w:val="20"/>
+              </w:rPr>
+              <w:t>_out</w:t>
+            </w:r>
+            <w:proofErr w:type="spellEnd"/>
+            <w:r>
+              <w:rPr>
+                <w:rFonts w:ascii="Calibri" w:hAnsi="Calibri"/>
+                <w:sz w:val="20"/>
+              </w:rPr>
+              <w:t xml:space="preserve"> }}</w:t>
+            </w:r>
+          </w:p>
+        </w:tc>
+        <w:tc>
+          <w:tcPr>
+            <w:tcW w:w="3420" w:type="dxa"/>
           </w:tcPr>
           <w:p>
             <w:r>
@@ -712,7 +760,7 @@
         </w:tc>
         <w:tc>
           <w:tcPr>
-            <w:tcW w:w="5400" w:type="dxa"/>
+            <w:tcW w:w="2695" w:type="dxa"/>
           </w:tcPr>
           <w:p>
             <w:pPr>
@@ -738,9 +786,58 @@
         </w:tc>
       </w:tr>
       <w:tr>
+        <w:trPr>
+          <w:trHeight w:val="287"/>
+        </w:trPr>
         <w:tc>
           <w:tcPr>
-            <w:tcW w:w="5400" w:type="dxa"/>
+            <w:tcW w:w="4032" w:type="dxa"/>
+          </w:tcPr>
+          <w:p>
+            <w:r>
+              <w:rPr>
+                <w:rFonts w:ascii="Calibri" w:hAnsi="Calibri"/>
+                <w:sz w:val="20"/>
+              </w:rPr>
+              <w:t xml:space="preserve">Package: </w:t>
+            </w:r>
+            <w:proofErr w:type="gramStart"/>
+            <w:r>
+              <w:rPr>
+                <w:rFonts w:ascii="Calibri" w:hAnsi="Calibri"/>
+                <w:sz w:val="20"/>
+              </w:rPr>
+              <w:t xml:space="preserve">{{ </w:t>
+            </w:r>
+            <w:proofErr w:type="spellStart"/>
+            <w:r>
+              <w:rPr>
+                <w:rFonts w:ascii="Calibri" w:hAnsi="Calibri"/>
+                <w:sz w:val="20"/>
+              </w:rPr>
+              <w:t>package</w:t>
+            </w:r>
+            <w:proofErr w:type="gramEnd"/>
+            <w:r>
+              <w:rPr>
+                <w:rFonts w:ascii="Calibri" w:hAnsi="Calibri"/>
+                <w:sz w:val="20"/>
+              </w:rPr>
+              <w:t>_title</w:t>
+            </w:r>
+            <w:proofErr w:type="spellEnd"/>
+            <w:r>
+              <w:rPr>
+                <w:rFonts w:ascii="Calibri" w:hAnsi="Calibri"/>
+                <w:sz w:val="20"/>
+              </w:rPr>
+              <w:t xml:space="preserve"> }}</w:t>
+            </w:r>
+          </w:p>
+        </w:tc>
+        <w:tc>
+          <w:tcPr>
+            <w:tcW w:w="3420" w:type="dxa"/>
           </w:tcPr>
           <w:p>
             <w:r>
@@ -750,18 +847,23 @@
         </w:tc>
         <w:tc>
           <w:tcPr>
-            <w:tcW w:w="5400" w:type="dxa"/>
+            <w:tcW w:w="2695" w:type="dxa"/>
           </w:tcPr>
           <w:p>
             <w:pPr>
               <w:jc w:val="right"/>
             </w:pPr>
+            <w:proofErr w:type="gramStart"/>
             <w:r>
               <w:t xml:space="preserve">{{ </w:t>
             </w:r>
             <w:proofErr w:type="spellStart"/>
             <w:r>
-              <w:t>total_vat</w:t>
+              <w:t>total</w:t>
+            </w:r>
+            <w:proofErr w:type="gramEnd"/>
+            <w:r>
+              <w:t>_vat</w:t>
             </w:r>
             <w:proofErr w:type="spellEnd"/>
             <w:r>
@@ -773,7 +875,53 @@
       <w:tr>
         <w:tc>
           <w:tcPr>
-            <w:tcW w:w="5400" w:type="dxa"/>
+            <w:tcW w:w="4032" w:type="dxa"/>
+          </w:tcPr>
+          <w:p>
+            <w:r>
+              <w:rPr>
+                <w:rFonts w:ascii="Calibri" w:hAnsi="Calibri"/>
+                <w:sz w:val="20"/>
+              </w:rPr>
+              <w:t xml:space="preserve">Total Guests: </w:t>
+            </w:r>
+            <w:proofErr w:type="gramStart"/>
+            <w:r>
+              <w:rPr>
+                <w:rFonts w:ascii="Calibri" w:hAnsi="Calibri"/>
+                <w:sz w:val="20"/>
+              </w:rPr>
+              <w:t xml:space="preserve">{{ </w:t>
+            </w:r>
+            <w:proofErr w:type="spellStart"/>
+            <w:r>
+              <w:rPr>
+                <w:rFonts w:ascii="Calibri" w:hAnsi="Calibri"/>
+                <w:sz w:val="20"/>
+              </w:rPr>
+              <w:t>total</w:t>
+            </w:r>
+            <w:proofErr w:type="gramEnd"/>
+            <w:r>
+              <w:rPr>
+                <w:rFonts w:ascii="Calibri" w:hAnsi="Calibri"/>
+                <w:sz w:val="20"/>
+              </w:rPr>
+              <w:t>_guests</w:t>
+            </w:r>
+            <w:proofErr w:type="spellEnd"/>
+            <w:r>
+              <w:rPr>
+                <w:rFonts w:ascii="Calibri" w:hAnsi="Calibri"/>
+                <w:sz w:val="20"/>
+              </w:rPr>
+              <w:t xml:space="preserve"> }}</w:t>
+            </w:r>
+          </w:p>
+        </w:tc>
+        <w:tc>
+          <w:tcPr>
+            <w:tcW w:w="3420" w:type="dxa"/>
           </w:tcPr>
           <w:p>
             <w:r>
@@ -783,18 +931,23 @@
         </w:tc>
         <w:tc>
           <w:tcPr>
-            <w:tcW w:w="5400" w:type="dxa"/>
+            <w:tcW w:w="2695" w:type="dxa"/>
           </w:tcPr>
           <w:p>
             <w:pPr>
               <w:jc w:val="right"/>
             </w:pPr>
+            <w:proofErr w:type="gramStart"/>
             <w:r>
               <w:t xml:space="preserve">{{ </w:t>
             </w:r>
             <w:proofErr w:type="spellStart"/>
             <w:r>
-              <w:t>property_fee</w:t>
+              <w:t>property</w:t>
+            </w:r>
+            <w:proofErr w:type="gramEnd"/>
+            <w:r>
+              <w:t>_fee</w:t>
             </w:r>
             <w:proofErr w:type="spellEnd"/>
             <w:r>
@@ -806,7 +959,13 @@
       <w:tr>
         <w:tc>
           <w:tcPr>
-            <w:tcW w:w="5400" w:type="dxa"/>
+            <w:tcW w:w="4032" w:type="dxa"/>
+          </w:tcPr>
+          <w:p/>
+        </w:tc>
+        <w:tc>
+          <w:tcPr>
+            <w:tcW w:w="3420" w:type="dxa"/>
           </w:tcPr>
           <w:p>
             <w:r>
@@ -816,18 +975,23 @@
         </w:tc>
         <w:tc>
           <w:tcPr>
-            <w:tcW w:w="5400" w:type="dxa"/>
+            <w:tcW w:w="2695" w:type="dxa"/>
           </w:tcPr>
           <w:p>
             <w:pPr>
               <w:jc w:val="right"/>
             </w:pPr>
+            <w:proofErr w:type="gramStart"/>
             <w:r>
               <w:t xml:space="preserve">{{ </w:t>
             </w:r>
             <w:proofErr w:type="spellStart"/>
             <w:r>
-              <w:t>total_due</w:t>
+              <w:t>total</w:t>
+            </w:r>
+            <w:proofErr w:type="gramEnd"/>
+            <w:r>
+              <w:t>_due</w:t>
             </w:r>
             <w:proofErr w:type="spellEnd"/>
             <w:r>
@@ -837,7 +1001,15 @@
         </w:tc>
       </w:tr>
     </w:tbl>
-    <w:p/>
+    <w:p>
+      <w:pPr>
+        <w:rPr>
+          <w:rFonts w:ascii="Calibri" w:hAnsi="Calibri"/>
+          <w:b/>
+          <w:sz w:val="24"/>
+        </w:rPr>
+      </w:pPr>
+    </w:p>
     <w:p>
       <w:r>
         <w:rPr>
@@ -1008,8 +1180,6 @@
         </w:tc>
       </w:tr>
     </w:tbl>
-    <w:p/>
-    <w:p/>
     <w:p>
       <w:pPr>
         <w:rPr>
@@ -1017,21 +1187,6 @@
           <w:b/>
         </w:rPr>
       </w:pPr>
-      <w:r>
-        <w:rPr>
-          <w:rFonts w:ascii="Calibri" w:hAnsi="Calibri"/>
-          <w:b/>
-        </w:rPr>
-        <w:br w:type="page"/>
-      </w:r>
-      <w:r>
-        <w:rPr>
-          <w:rFonts w:ascii="Calibri" w:hAnsi="Calibri"/>
-          <w:b/>
-        </w:rPr>
-        <w:lastRenderedPageBreak/>
-        <w:tab/>
-      </w:r>
       <w:r>
         <w:rPr>
           <w:rFonts w:ascii="Calibri" w:hAnsi="Calibri"/>
@@ -1065,7 +1220,23 @@
           <w:rFonts w:ascii="Calibri" w:hAnsi="Calibri"/>
           <w:b/>
         </w:rPr>
-        <w:t>Dominica VAT Summary:</w:t>
+        <w:tab/>
+      </w:r>
+    </w:p>
+    <w:p>
+      <w:pPr>
+        <w:ind w:left="2880" w:firstLine="720"/>
+        <w:rPr>
+          <w:rFonts w:ascii="Calibri" w:hAnsi="Calibri"/>
+          <w:b/>
+        </w:rPr>
+      </w:pPr>
+      <w:r>
+        <w:rPr>
+          <w:rFonts w:ascii="Calibri" w:hAnsi="Calibri"/>
+          <w:b/>
+        </w:rPr>
+        <w:t>DOMINICA VAT SUMMARY</w:t>
       </w:r>
     </w:p>
     <w:tbl>
@@ -1442,7 +1613,7 @@
           <w:rFonts w:ascii="Calibri" w:hAnsi="Calibri"/>
           <w:b/>
         </w:rPr>
-        <w:t>Payment Summary:</w:t>
+        <w:t>PAYMENT SUMMARY</w:t>
       </w:r>
     </w:p>
     <w:tbl>

</xml_diff>

<commit_message>
design(invoice): align compact summary headings
</commit_message>
<xml_diff>
--- a/invoice_template.docx
+++ b/invoice_template.docx
@@ -638,25 +638,33 @@
           <w:b/>
           <w:sz w:val="24"/>
         </w:rPr>
+        <w:tab/>
+      </w:r>
+      <w:r>
+        <w:rPr>
+          <w:rFonts w:ascii="Calibri" w:hAnsi="Calibri"/>
+          <w:b/>
+          <w:sz w:val="24"/>
+        </w:rPr>
         <w:t>FINANCIAL SUMMARY</w:t>
       </w:r>
     </w:p>
     <w:tbl>
       <w:tblPr>
         <w:tblStyle w:val="TableGrid"/>
-        <w:tblW w:w="0" w:type="auto"/>
+        <w:tblW w:w="10800" w:type="dxa"/>
         <w:tblInd w:w="-5" w:type="dxa"/>
         <w:tblLook w:val="04A0" w:firstRow="1" w:lastRow="0" w:firstColumn="1" w:lastColumn="0" w:noHBand="0" w:noVBand="1"/>
       </w:tblPr>
       <w:tblGrid>
-        <w:gridCol w:w="4032"/>
-        <w:gridCol w:w="3420"/>
-        <w:gridCol w:w="2695"/>
+        <w:gridCol w:w="6030"/>
+        <w:gridCol w:w="2700"/>
+        <w:gridCol w:w="2070"/>
       </w:tblGrid>
       <w:tr>
         <w:tc>
           <w:tcPr>
-            <w:tcW w:w="4032" w:type="dxa"/>
+            <w:tcW w:w="6030" w:type="dxa"/>
           </w:tcPr>
           <w:p>
             <w:r>
@@ -750,7 +758,7 @@
         </w:tc>
         <w:tc>
           <w:tcPr>
-            <w:tcW w:w="3420" w:type="dxa"/>
+            <w:tcW w:w="2700" w:type="dxa"/>
           </w:tcPr>
           <w:p>
             <w:r>
@@ -760,7 +768,7 @@
         </w:tc>
         <w:tc>
           <w:tcPr>
-            <w:tcW w:w="2695" w:type="dxa"/>
+            <w:tcW w:w="2070" w:type="dxa"/>
           </w:tcPr>
           <w:p>
             <w:pPr>
@@ -791,7 +799,7 @@
         </w:trPr>
         <w:tc>
           <w:tcPr>
-            <w:tcW w:w="4032" w:type="dxa"/>
+            <w:tcW w:w="6030" w:type="dxa"/>
           </w:tcPr>
           <w:p>
             <w:r>
@@ -837,7 +845,7 @@
         </w:tc>
         <w:tc>
           <w:tcPr>
-            <w:tcW w:w="3420" w:type="dxa"/>
+            <w:tcW w:w="2700" w:type="dxa"/>
           </w:tcPr>
           <w:p>
             <w:r>
@@ -847,7 +855,7 @@
         </w:tc>
         <w:tc>
           <w:tcPr>
-            <w:tcW w:w="2695" w:type="dxa"/>
+            <w:tcW w:w="2070" w:type="dxa"/>
           </w:tcPr>
           <w:p>
             <w:pPr>
@@ -875,7 +883,7 @@
       <w:tr>
         <w:tc>
           <w:tcPr>
-            <w:tcW w:w="4032" w:type="dxa"/>
+            <w:tcW w:w="6030" w:type="dxa"/>
           </w:tcPr>
           <w:p>
             <w:r>
@@ -921,7 +929,7 @@
         </w:tc>
         <w:tc>
           <w:tcPr>
-            <w:tcW w:w="3420" w:type="dxa"/>
+            <w:tcW w:w="2700" w:type="dxa"/>
           </w:tcPr>
           <w:p>
             <w:r>
@@ -931,7 +939,7 @@
         </w:tc>
         <w:tc>
           <w:tcPr>
-            <w:tcW w:w="2695" w:type="dxa"/>
+            <w:tcW w:w="2070" w:type="dxa"/>
           </w:tcPr>
           <w:p>
             <w:pPr>
@@ -959,13 +967,13 @@
       <w:tr>
         <w:tc>
           <w:tcPr>
-            <w:tcW w:w="4032" w:type="dxa"/>
+            <w:tcW w:w="6030" w:type="dxa"/>
           </w:tcPr>
           <w:p/>
         </w:tc>
         <w:tc>
           <w:tcPr>
-            <w:tcW w:w="3420" w:type="dxa"/>
+            <w:tcW w:w="2700" w:type="dxa"/>
           </w:tcPr>
           <w:p>
             <w:r>
@@ -975,7 +983,7 @@
         </w:tc>
         <w:tc>
           <w:tcPr>
-            <w:tcW w:w="2695" w:type="dxa"/>
+            <w:tcW w:w="2070" w:type="dxa"/>
           </w:tcPr>
           <w:p>
             <w:pPr>
@@ -1037,7 +1045,17 @@
             <w:tcW w:w="3600" w:type="dxa"/>
           </w:tcPr>
           <w:p>
+            <w:pPr>
+              <w:rPr>
+                <w:b/>
+                <w:bCs/>
+              </w:rPr>
+            </w:pPr>
             <w:r>
+              <w:rPr>
+                <w:b/>
+                <w:bCs/>
+              </w:rPr>
               <w:t>Room(s)</w:t>
             </w:r>
           </w:p>
@@ -1049,8 +1067,16 @@
           <w:p>
             <w:pPr>
               <w:jc w:val="right"/>
+              <w:rPr>
+                <w:b/>
+                <w:bCs/>
+              </w:rPr>
             </w:pPr>
             <w:r>
+              <w:rPr>
+                <w:b/>
+                <w:bCs/>
+              </w:rPr>
               <w:t>Qty</w:t>
             </w:r>
           </w:p>
@@ -1062,8 +1088,16 @@
           <w:p>
             <w:pPr>
               <w:jc w:val="right"/>
+              <w:rPr>
+                <w:b/>
+                <w:bCs/>
+              </w:rPr>
             </w:pPr>
             <w:r>
+              <w:rPr>
+                <w:b/>
+                <w:bCs/>
+              </w:rPr>
               <w:t>Nights</w:t>
             </w:r>
           </w:p>

</xml_diff>

<commit_message>
design(invoice): refine compact heading alignment
</commit_message>
<xml_diff>
--- a/invoice_template.docx
+++ b/invoice_template.docx
@@ -63,7 +63,6 @@
           </wp:anchor>
         </w:drawing>
       </w:r>
-      <w:proofErr w:type="gramStart"/>
       <w:r>
         <w:rPr>
           <w:rFonts w:ascii="Calibri" w:hAnsi="Calibri"/>
@@ -71,57 +70,7 @@
           <w:color w:val="0B6B6B"/>
           <w:sz w:val="36"/>
         </w:rPr>
-        <w:t xml:space="preserve">{{ </w:t>
-      </w:r>
-      <w:proofErr w:type="spellStart"/>
-      <w:r>
-        <w:rPr>
-          <w:rFonts w:ascii="Calibri" w:hAnsi="Calibri"/>
-          <w:b/>
-          <w:color w:val="0B6B6B"/>
-          <w:sz w:val="36"/>
-        </w:rPr>
-        <w:t>business</w:t>
-      </w:r>
-      <w:proofErr w:type="gramEnd"/>
-      <w:r>
-        <w:rPr>
-          <w:rFonts w:ascii="Calibri" w:hAnsi="Calibri"/>
-          <w:b/>
-          <w:color w:val="0B6B6B"/>
-          <w:sz w:val="36"/>
-        </w:rPr>
-        <w:t>_</w:t>
-      </w:r>
-      <w:proofErr w:type="gramStart"/>
-      <w:r>
-        <w:rPr>
-          <w:rFonts w:ascii="Calibri" w:hAnsi="Calibri"/>
-          <w:b/>
-          <w:color w:val="0B6B6B"/>
-          <w:sz w:val="36"/>
-        </w:rPr>
-        <w:t>name</w:t>
-      </w:r>
-      <w:proofErr w:type="spellEnd"/>
-      <w:r>
-        <w:rPr>
-          <w:rFonts w:ascii="Calibri" w:hAnsi="Calibri"/>
-          <w:b/>
-          <w:color w:val="0B6B6B"/>
-          <w:sz w:val="36"/>
-        </w:rPr>
-        <w:t xml:space="preserve"> }</w:t>
-      </w:r>
-      <w:proofErr w:type="gramEnd"/>
-      <w:r>
-        <w:rPr>
-          <w:rFonts w:ascii="Calibri" w:hAnsi="Calibri"/>
-          <w:b/>
-          <w:color w:val="0B6B6B"/>
-          <w:sz w:val="36"/>
-        </w:rPr>
-        <w:t>}</w:t>
+        <w:t>{{ business_name }}</w:t>
       </w:r>
     </w:p>
     <w:p>
@@ -139,225 +88,7 @@
           <w:sz w:val="24"/>
           <w:szCs w:val="24"/>
         </w:rPr>
-        <w:t xml:space="preserve">Caribbean </w:t>
-      </w:r>
-      <w:proofErr w:type="gramStart"/>
-      <w:r>
-        <w:rPr>
-          <w:rFonts w:ascii="Calibri" w:hAnsi="Calibri"/>
-          <w:b/>
-          <w:color w:val="0B6B6B"/>
-          <w:sz w:val="24"/>
-          <w:szCs w:val="24"/>
-        </w:rPr>
-        <w:t>Appalachia,</w:t>
-      </w:r>
-      <w:proofErr w:type="gramEnd"/>
-      <w:r>
-        <w:rPr>
-          <w:rFonts w:ascii="Calibri" w:hAnsi="Calibri"/>
-          <w:b/>
-          <w:color w:val="0B6B6B"/>
-          <w:sz w:val="24"/>
-          <w:szCs w:val="24"/>
-        </w:rPr>
-        <w:t xml:space="preserve"> Ltd.</w:t>
-      </w:r>
-    </w:p>
-    <w:p>
-      <w:proofErr w:type="gramStart"/>
-      <w:r>
-        <w:rPr>
-          <w:rFonts w:ascii="Calibri" w:hAnsi="Calibri"/>
-          <w:sz w:val="18"/>
-        </w:rPr>
-        <w:t xml:space="preserve">{{ </w:t>
-      </w:r>
-      <w:proofErr w:type="spellStart"/>
-      <w:r>
-        <w:rPr>
-          <w:rFonts w:ascii="Calibri" w:hAnsi="Calibri"/>
-          <w:sz w:val="18"/>
-        </w:rPr>
-        <w:t>business</w:t>
-      </w:r>
-      <w:proofErr w:type="gramEnd"/>
-      <w:r>
-        <w:rPr>
-          <w:rFonts w:ascii="Calibri" w:hAnsi="Calibri"/>
-          <w:sz w:val="18"/>
-        </w:rPr>
-        <w:t>_</w:t>
-      </w:r>
-      <w:proofErr w:type="gramStart"/>
-      <w:r>
-        <w:rPr>
-          <w:rFonts w:ascii="Calibri" w:hAnsi="Calibri"/>
-          <w:sz w:val="18"/>
-        </w:rPr>
-        <w:t>address</w:t>
-      </w:r>
-      <w:proofErr w:type="spellEnd"/>
-      <w:r>
-        <w:rPr>
-          <w:rFonts w:ascii="Calibri" w:hAnsi="Calibri"/>
-          <w:sz w:val="18"/>
-        </w:rPr>
-        <w:t xml:space="preserve"> }</w:t>
-      </w:r>
-      <w:proofErr w:type="gramEnd"/>
-      <w:r>
-        <w:rPr>
-          <w:rFonts w:ascii="Calibri" w:hAnsi="Calibri"/>
-          <w:sz w:val="18"/>
-        </w:rPr>
-        <w:t>}</w:t>
-      </w:r>
-    </w:p>
-    <w:p>
-      <w:proofErr w:type="gramStart"/>
-      <w:r>
-        <w:rPr>
-          <w:rFonts w:ascii="Calibri" w:hAnsi="Calibri"/>
-          <w:sz w:val="18"/>
-        </w:rPr>
-        <w:t xml:space="preserve">{{ </w:t>
-      </w:r>
-      <w:proofErr w:type="spellStart"/>
-      <w:r>
-        <w:rPr>
-          <w:rFonts w:ascii="Calibri" w:hAnsi="Calibri"/>
-          <w:sz w:val="18"/>
-        </w:rPr>
-        <w:t>business</w:t>
-      </w:r>
-      <w:proofErr w:type="gramEnd"/>
-      <w:r>
-        <w:rPr>
-          <w:rFonts w:ascii="Calibri" w:hAnsi="Calibri"/>
-          <w:sz w:val="18"/>
-        </w:rPr>
-        <w:t>_</w:t>
-      </w:r>
-      <w:proofErr w:type="gramStart"/>
-      <w:r>
-        <w:rPr>
-          <w:rFonts w:ascii="Calibri" w:hAnsi="Calibri"/>
-          <w:sz w:val="18"/>
-        </w:rPr>
-        <w:t>phone</w:t>
-      </w:r>
-      <w:proofErr w:type="spellEnd"/>
-      <w:r>
-        <w:rPr>
-          <w:rFonts w:ascii="Calibri" w:hAnsi="Calibri"/>
-          <w:sz w:val="18"/>
-        </w:rPr>
-        <w:t xml:space="preserve"> }</w:t>
-      </w:r>
-      <w:proofErr w:type="gramEnd"/>
-      <w:r>
-        <w:rPr>
-          <w:rFonts w:ascii="Calibri" w:hAnsi="Calibri"/>
-          <w:sz w:val="18"/>
-        </w:rPr>
-        <w:t xml:space="preserve">} | </w:t>
-      </w:r>
-      <w:proofErr w:type="gramStart"/>
-      <w:r>
-        <w:rPr>
-          <w:rFonts w:ascii="Calibri" w:hAnsi="Calibri"/>
-          <w:sz w:val="18"/>
-        </w:rPr>
-        <w:t xml:space="preserve">{{ </w:t>
-      </w:r>
-      <w:proofErr w:type="spellStart"/>
-      <w:r>
-        <w:rPr>
-          <w:rFonts w:ascii="Calibri" w:hAnsi="Calibri"/>
-          <w:sz w:val="18"/>
-        </w:rPr>
-        <w:t>business</w:t>
-      </w:r>
-      <w:proofErr w:type="gramEnd"/>
-      <w:r>
-        <w:rPr>
-          <w:rFonts w:ascii="Calibri" w:hAnsi="Calibri"/>
-          <w:sz w:val="18"/>
-        </w:rPr>
-        <w:t>_</w:t>
-      </w:r>
-      <w:proofErr w:type="gramStart"/>
-      <w:r>
-        <w:rPr>
-          <w:rFonts w:ascii="Calibri" w:hAnsi="Calibri"/>
-          <w:sz w:val="18"/>
-        </w:rPr>
-        <w:t>email</w:t>
-      </w:r>
-      <w:proofErr w:type="spellEnd"/>
-      <w:r>
-        <w:rPr>
-          <w:rFonts w:ascii="Calibri" w:hAnsi="Calibri"/>
-          <w:sz w:val="18"/>
-        </w:rPr>
-        <w:t xml:space="preserve"> }</w:t>
-      </w:r>
-      <w:proofErr w:type="gramEnd"/>
-      <w:r>
-        <w:rPr>
-          <w:rFonts w:ascii="Calibri" w:hAnsi="Calibri"/>
-          <w:sz w:val="18"/>
-        </w:rPr>
-        <w:t xml:space="preserve">} | </w:t>
-      </w:r>
-      <w:proofErr w:type="gramStart"/>
-      <w:r>
-        <w:rPr>
-          <w:rFonts w:ascii="Calibri" w:hAnsi="Calibri"/>
-          <w:sz w:val="18"/>
-        </w:rPr>
-        <w:t xml:space="preserve">{{ </w:t>
-      </w:r>
-      <w:proofErr w:type="spellStart"/>
-      <w:r>
-        <w:rPr>
-          <w:rFonts w:ascii="Calibri" w:hAnsi="Calibri"/>
-          <w:sz w:val="18"/>
-        </w:rPr>
-        <w:t>business</w:t>
-      </w:r>
-      <w:proofErr w:type="gramEnd"/>
-      <w:r>
-        <w:rPr>
-          <w:rFonts w:ascii="Calibri" w:hAnsi="Calibri"/>
-          <w:sz w:val="18"/>
-        </w:rPr>
-        <w:t>_</w:t>
-      </w:r>
-      <w:proofErr w:type="gramStart"/>
-      <w:r>
-        <w:rPr>
-          <w:rFonts w:ascii="Calibri" w:hAnsi="Calibri"/>
-          <w:sz w:val="18"/>
-        </w:rPr>
-        <w:t>website</w:t>
-      </w:r>
-      <w:proofErr w:type="spellEnd"/>
-      <w:r>
-        <w:rPr>
-          <w:rFonts w:ascii="Calibri" w:hAnsi="Calibri"/>
-          <w:sz w:val="18"/>
-        </w:rPr>
-        <w:t xml:space="preserve"> }</w:t>
-      </w:r>
-      <w:proofErr w:type="gramEnd"/>
-      <w:r>
-        <w:rPr>
-          <w:rFonts w:ascii="Calibri" w:hAnsi="Calibri"/>
-          <w:sz w:val="18"/>
-        </w:rPr>
-        <w:t>}</w:t>
+        <w:t>Caribbean Appalachia, Ltd.</w:t>
       </w:r>
     </w:p>
     <w:p>
@@ -366,23 +97,25 @@
           <w:rFonts w:ascii="Calibri" w:hAnsi="Calibri"/>
           <w:sz w:val="18"/>
         </w:rPr>
-        <w:t xml:space="preserve">Tax ID: {{ </w:t>
+        <w:t>{{ business_address }}</w:t>
       </w:r>
-      <w:proofErr w:type="spellStart"/>
+    </w:p>
+    <w:p>
       <w:r>
         <w:rPr>
           <w:rFonts w:ascii="Calibri" w:hAnsi="Calibri"/>
           <w:sz w:val="18"/>
         </w:rPr>
-        <w:t>tax_id</w:t>
+        <w:t>{{ business_phone }} | {{ business_email }} | {{ business_website }}</w:t>
       </w:r>
-      <w:proofErr w:type="spellEnd"/>
+    </w:p>
+    <w:p>
       <w:r>
         <w:rPr>
           <w:rFonts w:ascii="Calibri" w:hAnsi="Calibri"/>
           <w:sz w:val="18"/>
         </w:rPr>
-        <w:t xml:space="preserve"> }}</w:t>
+        <w:t>Tax ID: {{ tax_id }}</w:t>
       </w:r>
     </w:p>
     <w:p>
@@ -404,27 +137,7 @@
           <w:color w:val="0B6B6B"/>
           <w:sz w:val="32"/>
         </w:rPr>
-        <w:t xml:space="preserve">{{ </w:t>
-      </w:r>
-      <w:proofErr w:type="spellStart"/>
-      <w:r>
-        <w:rPr>
-          <w:rFonts w:ascii="Calibri" w:hAnsi="Calibri"/>
-          <w:b/>
-          <w:color w:val="0B6B6B"/>
-          <w:sz w:val="32"/>
-        </w:rPr>
-        <w:t>guest_name</w:t>
-      </w:r>
-      <w:proofErr w:type="spellEnd"/>
-      <w:r>
-        <w:rPr>
-          <w:rFonts w:ascii="Calibri" w:hAnsi="Calibri"/>
-          <w:b/>
-          <w:color w:val="0B6B6B"/>
-          <w:sz w:val="32"/>
-        </w:rPr>
-        <w:t xml:space="preserve"> }}</w:t>
+        <w:t>{{ guest_name }}</w:t>
       </w:r>
     </w:p>
     <w:tbl>
@@ -454,15 +167,7 @@
           </w:tcPr>
           <w:p>
             <w:r>
-              <w:t xml:space="preserve">{{ </w:t>
-            </w:r>
-            <w:proofErr w:type="spellStart"/>
-            <w:r>
-              <w:t>invoice_number</w:t>
-            </w:r>
-            <w:proofErr w:type="spellEnd"/>
-            <w:r>
-              <w:t xml:space="preserve"> }}</w:t>
+              <w:t>{{ invoice_number }}</w:t>
             </w:r>
           </w:p>
         </w:tc>
@@ -484,15 +189,7 @@
           </w:tcPr>
           <w:p>
             <w:r>
-              <w:t xml:space="preserve">{{ </w:t>
-            </w:r>
-            <w:proofErr w:type="spellStart"/>
-            <w:r>
-              <w:t>issue_date</w:t>
-            </w:r>
-            <w:proofErr w:type="spellEnd"/>
-            <w:r>
-              <w:t xml:space="preserve"> }}</w:t>
+              <w:t>{{ issue_date }}</w:t>
             </w:r>
           </w:p>
         </w:tc>
@@ -536,39 +233,15 @@
           </w:tcPr>
           <w:p>
             <w:r>
-              <w:t xml:space="preserve">{{ </w:t>
-            </w:r>
-            <w:proofErr w:type="spellStart"/>
-            <w:r>
-              <w:t>guest_name</w:t>
-            </w:r>
-            <w:proofErr w:type="spellEnd"/>
-            <w:r>
-              <w:t xml:space="preserve"> }}</w:t>
+              <w:t>{{ guest_name }}</w:t>
             </w:r>
             <w:r>
               <w:br/>
-              <w:t xml:space="preserve">{{ </w:t>
-            </w:r>
-            <w:proofErr w:type="spellStart"/>
-            <w:r>
-              <w:t>guest_email</w:t>
-            </w:r>
-            <w:proofErr w:type="spellEnd"/>
-            <w:r>
-              <w:t xml:space="preserve"> }}</w:t>
+              <w:t>{{ guest_email }}</w:t>
             </w:r>
             <w:r>
               <w:br/>
-              <w:t xml:space="preserve">{{ </w:t>
-            </w:r>
-            <w:proofErr w:type="spellStart"/>
-            <w:r>
-              <w:t>guest_phone</w:t>
-            </w:r>
-            <w:proofErr w:type="spellEnd"/>
-            <w:r>
-              <w:t xml:space="preserve"> }}</w:t>
+              <w:t>{{ guest_phone }}</w:t>
             </w:r>
           </w:p>
         </w:tc>
@@ -630,22 +303,6 @@
           <w:b/>
           <w:sz w:val="24"/>
         </w:rPr>
-        <w:tab/>
-      </w:r>
-      <w:r>
-        <w:rPr>
-          <w:rFonts w:ascii="Calibri" w:hAnsi="Calibri"/>
-          <w:b/>
-          <w:sz w:val="24"/>
-        </w:rPr>
-        <w:tab/>
-      </w:r>
-      <w:r>
-        <w:rPr>
-          <w:rFonts w:ascii="Calibri" w:hAnsi="Calibri"/>
-          <w:b/>
-          <w:sz w:val="24"/>
-        </w:rPr>
         <w:t>FINANCIAL SUMMARY</w:t>
       </w:r>
     </w:p>
@@ -657,14 +314,14 @@
         <w:tblLook w:val="04A0" w:firstRow="1" w:lastRow="0" w:firstColumn="1" w:lastColumn="0" w:noHBand="0" w:noVBand="1"/>
       </w:tblPr>
       <w:tblGrid>
-        <w:gridCol w:w="6030"/>
-        <w:gridCol w:w="2700"/>
+        <w:gridCol w:w="5760"/>
+        <w:gridCol w:w="2970"/>
         <w:gridCol w:w="2070"/>
       </w:tblGrid>
       <w:tr>
         <w:tc>
           <w:tcPr>
-            <w:tcW w:w="6030" w:type="dxa"/>
+            <w:tcW w:w="5760" w:type="dxa"/>
           </w:tcPr>
           <w:p>
             <w:r>
@@ -672,93 +329,13 @@
                 <w:rFonts w:ascii="Calibri" w:hAnsi="Calibri"/>
                 <w:sz w:val="20"/>
               </w:rPr>
-              <w:t xml:space="preserve">Stay: </w:t>
-            </w:r>
-            <w:proofErr w:type="gramStart"/>
-            <w:r>
-              <w:rPr>
-                <w:rFonts w:ascii="Calibri" w:hAnsi="Calibri"/>
-                <w:sz w:val="20"/>
-              </w:rPr>
-              <w:t xml:space="preserve">{{ </w:t>
-            </w:r>
-            <w:proofErr w:type="spellStart"/>
-            <w:r>
-              <w:rPr>
-                <w:rFonts w:ascii="Calibri" w:hAnsi="Calibri"/>
-                <w:sz w:val="20"/>
-              </w:rPr>
-              <w:t>check</w:t>
-            </w:r>
-            <w:proofErr w:type="gramEnd"/>
-            <w:r>
-              <w:rPr>
-                <w:rFonts w:ascii="Calibri" w:hAnsi="Calibri"/>
-                <w:sz w:val="20"/>
-              </w:rPr>
-              <w:t>_</w:t>
-            </w:r>
-            <w:proofErr w:type="gramStart"/>
-            <w:r>
-              <w:rPr>
-                <w:rFonts w:ascii="Calibri" w:hAnsi="Calibri"/>
-                <w:sz w:val="20"/>
-              </w:rPr>
-              <w:t>in</w:t>
-            </w:r>
-            <w:proofErr w:type="spellEnd"/>
-            <w:r>
-              <w:rPr>
-                <w:rFonts w:ascii="Calibri" w:hAnsi="Calibri"/>
-                <w:sz w:val="20"/>
-              </w:rPr>
-              <w:t xml:space="preserve"> }</w:t>
-            </w:r>
-            <w:proofErr w:type="gramEnd"/>
-            <w:r>
-              <w:rPr>
-                <w:rFonts w:ascii="Calibri" w:hAnsi="Calibri"/>
-                <w:sz w:val="20"/>
-              </w:rPr>
-              <w:t xml:space="preserve">} to </w:t>
-            </w:r>
-            <w:proofErr w:type="gramStart"/>
-            <w:r>
-              <w:rPr>
-                <w:rFonts w:ascii="Calibri" w:hAnsi="Calibri"/>
-                <w:sz w:val="20"/>
-              </w:rPr>
-              <w:t xml:space="preserve">{{ </w:t>
-            </w:r>
-            <w:proofErr w:type="spellStart"/>
-            <w:r>
-              <w:rPr>
-                <w:rFonts w:ascii="Calibri" w:hAnsi="Calibri"/>
-                <w:sz w:val="20"/>
-              </w:rPr>
-              <w:t>check</w:t>
-            </w:r>
-            <w:proofErr w:type="gramEnd"/>
-            <w:r>
-              <w:rPr>
-                <w:rFonts w:ascii="Calibri" w:hAnsi="Calibri"/>
-                <w:sz w:val="20"/>
-              </w:rPr>
-              <w:t>_out</w:t>
-            </w:r>
-            <w:proofErr w:type="spellEnd"/>
-            <w:r>
-              <w:rPr>
-                <w:rFonts w:ascii="Calibri" w:hAnsi="Calibri"/>
-                <w:sz w:val="20"/>
-              </w:rPr>
-              <w:t xml:space="preserve"> }}</w:t>
+              <w:t>Stay: {{ check_in }} to {{ check_out }}</w:t>
             </w:r>
           </w:p>
         </w:tc>
         <w:tc>
           <w:tcPr>
-            <w:tcW w:w="2700" w:type="dxa"/>
+            <w:tcW w:w="2970" w:type="dxa"/>
           </w:tcPr>
           <w:p>
             <w:r>
@@ -774,21 +351,8 @@
             <w:pPr>
               <w:jc w:val="right"/>
             </w:pPr>
-            <w:proofErr w:type="gramStart"/>
             <w:r>
-              <w:t xml:space="preserve">{{ </w:t>
-            </w:r>
-            <w:proofErr w:type="spellStart"/>
-            <w:r>
-              <w:t>subtotal</w:t>
-            </w:r>
-            <w:proofErr w:type="gramEnd"/>
-            <w:r>
-              <w:t>_net</w:t>
-            </w:r>
-            <w:proofErr w:type="spellEnd"/>
-            <w:r>
-              <w:t xml:space="preserve"> }}</w:t>
+              <w:t>{{ subtotal_net }}</w:t>
             </w:r>
           </w:p>
         </w:tc>
@@ -799,7 +363,7 @@
         </w:trPr>
         <w:tc>
           <w:tcPr>
-            <w:tcW w:w="6030" w:type="dxa"/>
+            <w:tcW w:w="5760" w:type="dxa"/>
           </w:tcPr>
           <w:p>
             <w:r>
@@ -807,45 +371,13 @@
                 <w:rFonts w:ascii="Calibri" w:hAnsi="Calibri"/>
                 <w:sz w:val="20"/>
               </w:rPr>
-              <w:t xml:space="preserve">Package: </w:t>
-            </w:r>
-            <w:proofErr w:type="gramStart"/>
-            <w:r>
-              <w:rPr>
-                <w:rFonts w:ascii="Calibri" w:hAnsi="Calibri"/>
-                <w:sz w:val="20"/>
-              </w:rPr>
-              <w:t xml:space="preserve">{{ </w:t>
-            </w:r>
-            <w:proofErr w:type="spellStart"/>
-            <w:r>
-              <w:rPr>
-                <w:rFonts w:ascii="Calibri" w:hAnsi="Calibri"/>
-                <w:sz w:val="20"/>
-              </w:rPr>
-              <w:t>package</w:t>
-            </w:r>
-            <w:proofErr w:type="gramEnd"/>
-            <w:r>
-              <w:rPr>
-                <w:rFonts w:ascii="Calibri" w:hAnsi="Calibri"/>
-                <w:sz w:val="20"/>
-              </w:rPr>
-              <w:t>_title</w:t>
-            </w:r>
-            <w:proofErr w:type="spellEnd"/>
-            <w:r>
-              <w:rPr>
-                <w:rFonts w:ascii="Calibri" w:hAnsi="Calibri"/>
-                <w:sz w:val="20"/>
-              </w:rPr>
-              <w:t xml:space="preserve"> }}</w:t>
+              <w:t>Package: {{ package_title }}</w:t>
             </w:r>
           </w:p>
         </w:tc>
         <w:tc>
           <w:tcPr>
-            <w:tcW w:w="2700" w:type="dxa"/>
+            <w:tcW w:w="2970" w:type="dxa"/>
           </w:tcPr>
           <w:p>
             <w:r>
@@ -861,21 +393,8 @@
             <w:pPr>
               <w:jc w:val="right"/>
             </w:pPr>
-            <w:proofErr w:type="gramStart"/>
             <w:r>
-              <w:t xml:space="preserve">{{ </w:t>
-            </w:r>
-            <w:proofErr w:type="spellStart"/>
-            <w:r>
-              <w:t>total</w:t>
-            </w:r>
-            <w:proofErr w:type="gramEnd"/>
-            <w:r>
-              <w:t>_vat</w:t>
-            </w:r>
-            <w:proofErr w:type="spellEnd"/>
-            <w:r>
-              <w:t xml:space="preserve"> }}</w:t>
+              <w:t>{{ total_vat }}</w:t>
             </w:r>
           </w:p>
         </w:tc>
@@ -883,7 +402,7 @@
       <w:tr>
         <w:tc>
           <w:tcPr>
-            <w:tcW w:w="6030" w:type="dxa"/>
+            <w:tcW w:w="5760" w:type="dxa"/>
           </w:tcPr>
           <w:p>
             <w:r>
@@ -891,45 +410,13 @@
                 <w:rFonts w:ascii="Calibri" w:hAnsi="Calibri"/>
                 <w:sz w:val="20"/>
               </w:rPr>
-              <w:t xml:space="preserve">Total Guests: </w:t>
-            </w:r>
-            <w:proofErr w:type="gramStart"/>
-            <w:r>
-              <w:rPr>
-                <w:rFonts w:ascii="Calibri" w:hAnsi="Calibri"/>
-                <w:sz w:val="20"/>
-              </w:rPr>
-              <w:t xml:space="preserve">{{ </w:t>
-            </w:r>
-            <w:proofErr w:type="spellStart"/>
-            <w:r>
-              <w:rPr>
-                <w:rFonts w:ascii="Calibri" w:hAnsi="Calibri"/>
-                <w:sz w:val="20"/>
-              </w:rPr>
-              <w:t>total</w:t>
-            </w:r>
-            <w:proofErr w:type="gramEnd"/>
-            <w:r>
-              <w:rPr>
-                <w:rFonts w:ascii="Calibri" w:hAnsi="Calibri"/>
-                <w:sz w:val="20"/>
-              </w:rPr>
-              <w:t>_guests</w:t>
-            </w:r>
-            <w:proofErr w:type="spellEnd"/>
-            <w:r>
-              <w:rPr>
-                <w:rFonts w:ascii="Calibri" w:hAnsi="Calibri"/>
-                <w:sz w:val="20"/>
-              </w:rPr>
-              <w:t xml:space="preserve"> }}</w:t>
+              <w:t>Total Guests: {{ total_guests }}</w:t>
             </w:r>
           </w:p>
         </w:tc>
         <w:tc>
           <w:tcPr>
-            <w:tcW w:w="2700" w:type="dxa"/>
+            <w:tcW w:w="2970" w:type="dxa"/>
           </w:tcPr>
           <w:p>
             <w:r>
@@ -945,21 +432,8 @@
             <w:pPr>
               <w:jc w:val="right"/>
             </w:pPr>
-            <w:proofErr w:type="gramStart"/>
             <w:r>
-              <w:t xml:space="preserve">{{ </w:t>
-            </w:r>
-            <w:proofErr w:type="spellStart"/>
-            <w:r>
-              <w:t>property</w:t>
-            </w:r>
-            <w:proofErr w:type="gramEnd"/>
-            <w:r>
-              <w:t>_fee</w:t>
-            </w:r>
-            <w:proofErr w:type="spellEnd"/>
-            <w:r>
-              <w:t xml:space="preserve"> }}</w:t>
+              <w:t>{{ property_fee }}</w:t>
             </w:r>
           </w:p>
         </w:tc>
@@ -967,13 +441,13 @@
       <w:tr>
         <w:tc>
           <w:tcPr>
-            <w:tcW w:w="6030" w:type="dxa"/>
+            <w:tcW w:w="5760" w:type="dxa"/>
           </w:tcPr>
           <w:p/>
         </w:tc>
         <w:tc>
           <w:tcPr>
-            <w:tcW w:w="2700" w:type="dxa"/>
+            <w:tcW w:w="2970" w:type="dxa"/>
           </w:tcPr>
           <w:p>
             <w:r>
@@ -989,21 +463,8 @@
             <w:pPr>
               <w:jc w:val="right"/>
             </w:pPr>
-            <w:proofErr w:type="gramStart"/>
             <w:r>
-              <w:t xml:space="preserve">{{ </w:t>
-            </w:r>
-            <w:proofErr w:type="spellStart"/>
-            <w:r>
-              <w:t>total</w:t>
-            </w:r>
-            <w:proofErr w:type="gramEnd"/>
-            <w:r>
-              <w:t>_due</w:t>
-            </w:r>
-            <w:proofErr w:type="spellEnd"/>
-            <w:r>
-              <w:t xml:space="preserve"> }}</w:t>
+              <w:t>{{ total_due }}</w:t>
             </w:r>
           </w:p>
         </w:tc>
@@ -1147,15 +608,7 @@
               <w:jc w:val="right"/>
             </w:pPr>
             <w:r>
-              <w:t xml:space="preserve">{{ </w:t>
-            </w:r>
-            <w:proofErr w:type="spellStart"/>
-            <w:r>
-              <w:t>room.quantity</w:t>
-            </w:r>
-            <w:proofErr w:type="spellEnd"/>
-            <w:r>
-              <w:t xml:space="preserve"> }}</w:t>
+              <w:t>{{ room.quantity }}</w:t>
             </w:r>
           </w:p>
         </w:tc>
@@ -1168,15 +621,7 @@
               <w:jc w:val="right"/>
             </w:pPr>
             <w:r>
-              <w:t xml:space="preserve">{{ </w:t>
-            </w:r>
-            <w:proofErr w:type="spellStart"/>
-            <w:r>
-              <w:t>room.nights</w:t>
-            </w:r>
-            <w:proofErr w:type="spellEnd"/>
-            <w:r>
-              <w:t xml:space="preserve"> }}</w:t>
+              <w:t>{{ room.nights }}</w:t>
             </w:r>
           </w:p>
         </w:tc>
@@ -1188,15 +633,7 @@
           </w:tcPr>
           <w:p>
             <w:r>
-              <w:t xml:space="preserve">{%tr </w:t>
-            </w:r>
-            <w:proofErr w:type="spellStart"/>
-            <w:r>
-              <w:t>endfor</w:t>
-            </w:r>
-            <w:proofErr w:type="spellEnd"/>
-            <w:r>
-              <w:t xml:space="preserve"> %}</w:t>
+              <w:t>{%tr endfor %}</w:t>
             </w:r>
           </w:p>
         </w:tc>
@@ -1339,37 +776,12 @@
                 <w:sz w:val="20"/>
               </w:rPr>
             </w:pPr>
-            <w:proofErr w:type="gramStart"/>
             <w:r>
               <w:rPr>
                 <w:rFonts w:ascii="Calibri" w:hAnsi="Calibri"/>
                 <w:sz w:val="20"/>
               </w:rPr>
-              <w:t xml:space="preserve">{{ </w:t>
-            </w:r>
-            <w:proofErr w:type="spellStart"/>
-            <w:r>
-              <w:rPr>
-                <w:rFonts w:ascii="Calibri" w:hAnsi="Calibri"/>
-                <w:sz w:val="20"/>
-              </w:rPr>
-              <w:t>subtotal</w:t>
-            </w:r>
-            <w:proofErr w:type="gramEnd"/>
-            <w:r>
-              <w:rPr>
-                <w:rFonts w:ascii="Calibri" w:hAnsi="Calibri"/>
-                <w:sz w:val="20"/>
-              </w:rPr>
-              <w:t>_net</w:t>
-            </w:r>
-            <w:proofErr w:type="spellEnd"/>
-            <w:r>
-              <w:rPr>
-                <w:rFonts w:ascii="Calibri" w:hAnsi="Calibri"/>
-                <w:sz w:val="20"/>
-              </w:rPr>
-              <w:t xml:space="preserve"> }}</w:t>
+              <w:t>{{ subtotal_net }}</w:t>
             </w:r>
           </w:p>
         </w:tc>
@@ -1408,37 +820,12 @@
                 <w:sz w:val="20"/>
               </w:rPr>
             </w:pPr>
-            <w:proofErr w:type="gramStart"/>
             <w:r>
               <w:rPr>
                 <w:rFonts w:ascii="Calibri" w:hAnsi="Calibri"/>
                 <w:sz w:val="20"/>
               </w:rPr>
-              <w:t xml:space="preserve">{{ </w:t>
-            </w:r>
-            <w:proofErr w:type="spellStart"/>
-            <w:r>
-              <w:rPr>
-                <w:rFonts w:ascii="Calibri" w:hAnsi="Calibri"/>
-                <w:sz w:val="20"/>
-              </w:rPr>
-              <w:t>accommodation</w:t>
-            </w:r>
-            <w:proofErr w:type="gramEnd"/>
-            <w:r>
-              <w:rPr>
-                <w:rFonts w:ascii="Calibri" w:hAnsi="Calibri"/>
-                <w:sz w:val="20"/>
-              </w:rPr>
-              <w:t>_vat_formula</w:t>
-            </w:r>
-            <w:proofErr w:type="spellEnd"/>
-            <w:r>
-              <w:rPr>
-                <w:rFonts w:ascii="Calibri" w:hAnsi="Calibri"/>
-                <w:sz w:val="20"/>
-              </w:rPr>
-              <w:t xml:space="preserve"> }}</w:t>
+              <w:t>{{ accommodation_vat_formula }}</w:t>
             </w:r>
           </w:p>
         </w:tc>
@@ -1491,37 +878,12 @@
                 <w:sz w:val="20"/>
               </w:rPr>
             </w:pPr>
-            <w:proofErr w:type="gramStart"/>
             <w:r>
               <w:rPr>
                 <w:rFonts w:ascii="Calibri" w:hAnsi="Calibri"/>
                 <w:sz w:val="20"/>
               </w:rPr>
-              <w:t xml:space="preserve">{{ </w:t>
-            </w:r>
-            <w:proofErr w:type="spellStart"/>
-            <w:r>
-              <w:rPr>
-                <w:rFonts w:ascii="Calibri" w:hAnsi="Calibri"/>
-                <w:sz w:val="20"/>
-              </w:rPr>
-              <w:t>services</w:t>
-            </w:r>
-            <w:proofErr w:type="gramEnd"/>
-            <w:r>
-              <w:rPr>
-                <w:rFonts w:ascii="Calibri" w:hAnsi="Calibri"/>
-                <w:sz w:val="20"/>
-              </w:rPr>
-              <w:t>_vat_formula</w:t>
-            </w:r>
-            <w:proofErr w:type="spellEnd"/>
-            <w:r>
-              <w:rPr>
-                <w:rFonts w:ascii="Calibri" w:hAnsi="Calibri"/>
-                <w:sz w:val="20"/>
-              </w:rPr>
-              <w:t xml:space="preserve"> }}</w:t>
+              <w:t>{{ services_vat_formula }}</w:t>
             </w:r>
           </w:p>
         </w:tc>
@@ -1593,7 +955,6 @@
                 <w:sz w:val="20"/>
               </w:rPr>
             </w:pPr>
-            <w:proofErr w:type="gramStart"/>
             <w:r>
               <w:rPr>
                 <w:rFonts w:ascii="Calibri" w:hAnsi="Calibri"/>
@@ -1601,37 +962,7 @@
                 <w:color w:val="0B6B6B"/>
                 <w:sz w:val="20"/>
               </w:rPr>
-              <w:t xml:space="preserve">{{ </w:t>
-            </w:r>
-            <w:proofErr w:type="spellStart"/>
-            <w:r>
-              <w:rPr>
-                <w:rFonts w:ascii="Calibri" w:hAnsi="Calibri"/>
-                <w:b/>
-                <w:color w:val="0B6B6B"/>
-                <w:sz w:val="20"/>
-              </w:rPr>
-              <w:t>total</w:t>
-            </w:r>
-            <w:proofErr w:type="gramEnd"/>
-            <w:r>
-              <w:rPr>
-                <w:rFonts w:ascii="Calibri" w:hAnsi="Calibri"/>
-                <w:b/>
-                <w:color w:val="0B6B6B"/>
-                <w:sz w:val="20"/>
-              </w:rPr>
-              <w:t>_vat</w:t>
-            </w:r>
-            <w:proofErr w:type="spellEnd"/>
-            <w:r>
-              <w:rPr>
-                <w:rFonts w:ascii="Calibri" w:hAnsi="Calibri"/>
-                <w:b/>
-                <w:color w:val="0B6B6B"/>
-                <w:sz w:val="20"/>
-              </w:rPr>
-              <w:t xml:space="preserve"> }}</w:t>
+              <w:t>{{ total_vat }}</w:t>
             </w:r>
           </w:p>
         </w:tc>
@@ -1668,15 +999,7 @@
           </w:tcPr>
           <w:p>
             <w:r>
-              <w:t xml:space="preserve">{%tr for payment in </w:t>
-            </w:r>
-            <w:proofErr w:type="gramStart"/>
-            <w:r>
-              <w:t>payments[</w:t>
-            </w:r>
-            <w:proofErr w:type="gramEnd"/>
-            <w:r>
-              <w:t>:4] %}</w:t>
+              <w:t>{%tr for payment in payments[:4] %}</w:t>
             </w:r>
           </w:p>
         </w:tc>
@@ -1694,15 +1017,7 @@
           </w:tcPr>
           <w:p>
             <w:r>
-              <w:t xml:space="preserve">{{ </w:t>
-            </w:r>
-            <w:proofErr w:type="spellStart"/>
-            <w:r>
-              <w:t>payment.date</w:t>
-            </w:r>
-            <w:proofErr w:type="spellEnd"/>
-            <w:r>
-              <w:t xml:space="preserve"> }}</w:t>
+              <w:t>{{ payment.date }}</w:t>
             </w:r>
           </w:p>
         </w:tc>
@@ -1715,15 +1030,7 @@
               <w:jc w:val="right"/>
             </w:pPr>
             <w:r>
-              <w:t xml:space="preserve">{{ </w:t>
-            </w:r>
-            <w:proofErr w:type="spellStart"/>
-            <w:r>
-              <w:t>payment.amount</w:t>
-            </w:r>
-            <w:proofErr w:type="spellEnd"/>
-            <w:r>
-              <w:t xml:space="preserve"> }}</w:t>
+              <w:t>{{ payment.amount }}</w:t>
             </w:r>
           </w:p>
         </w:tc>
@@ -1735,15 +1042,7 @@
           </w:tcPr>
           <w:p>
             <w:r>
-              <w:t xml:space="preserve">{%tr </w:t>
-            </w:r>
-            <w:proofErr w:type="spellStart"/>
-            <w:r>
-              <w:t>endfor</w:t>
-            </w:r>
-            <w:proofErr w:type="spellEnd"/>
-            <w:r>
-              <w:t xml:space="preserve"> %}</w:t>
+              <w:t>{%tr endfor %}</w:t>
             </w:r>
           </w:p>
         </w:tc>
@@ -1774,15 +1073,7 @@
               <w:jc w:val="right"/>
             </w:pPr>
             <w:r>
-              <w:t xml:space="preserve">{{ </w:t>
-            </w:r>
-            <w:proofErr w:type="spellStart"/>
-            <w:r>
-              <w:t>remaining_balance</w:t>
-            </w:r>
-            <w:proofErr w:type="spellEnd"/>
-            <w:r>
-              <w:t xml:space="preserve"> }}</w:t>
+              <w:t>{{ remaining_balance }}</w:t>
             </w:r>
           </w:p>
         </w:tc>
@@ -1815,15 +1106,7 @@
         <w:t xml:space="preserve">Payment Terms: </w:t>
       </w:r>
       <w:r>
-        <w:t xml:space="preserve">A 50% deposit is processed upon </w:t>
-      </w:r>
-      <w:proofErr w:type="gramStart"/>
-      <w:r>
-        <w:t>booking</w:t>
-      </w:r>
-      <w:proofErr w:type="gramEnd"/>
-      <w:r>
-        <w:t xml:space="preserve"> and the remaining balance will be processed 30 days prior to</w:t>
+        <w:t>A 50% deposit is processed upon booking and the remaining balance will be processed 30 days prior to</w:t>
       </w:r>
       <w:r>
         <w:t xml:space="preserve"> </w:t>
@@ -1844,39 +1127,7 @@
           <w:b/>
           <w:bCs/>
         </w:rPr>
-        <w:t xml:space="preserve">Charge will show on your credit card </w:t>
-      </w:r>
-      <w:proofErr w:type="gramStart"/>
-      <w:r>
-        <w:rPr>
-          <w:b/>
-          <w:bCs/>
-        </w:rPr>
-        <w:t>as</w:t>
-      </w:r>
-      <w:proofErr w:type="gramEnd"/>
-      <w:r>
-        <w:rPr>
-          <w:b/>
-          <w:bCs/>
-        </w:rPr>
-        <w:t xml:space="preserve"> Caribbean </w:t>
-      </w:r>
-      <w:proofErr w:type="gramStart"/>
-      <w:r>
-        <w:rPr>
-          <w:b/>
-          <w:bCs/>
-        </w:rPr>
-        <w:t>Appalachia,</w:t>
-      </w:r>
-      <w:proofErr w:type="gramEnd"/>
-      <w:r>
-        <w:rPr>
-          <w:b/>
-          <w:bCs/>
-        </w:rPr>
-        <w:t xml:space="preserve"> Ltd.</w:t>
+        <w:t>Charge will show on your credit card as Caribbean Appalachia, Ltd.</w:t>
       </w:r>
     </w:p>
     <w:p>

</xml_diff>